<commit_message>
Add EFDS membership review and account management
</commit_message>
<xml_diff>
--- a/docs/EFDS_Committee_Account_Setup_Guide.docx
+++ b/docs/EFDS_Committee_Account_Setup_Guide.docx
@@ -4,382 +4,631 @@
   <w:body>
     <w:p>
       <w:pPr>
-        <w:spacing w:before="200"/>
+        <w:pStyle w:val="Title"/>
       </w:pPr>
+      <w:r>
+        <w:t>Your EFDS committee account</w:t>
+      </w:r>
+    </w:p>
+    <w:p>
       <w:r>
         <w:rPr>
           <w:b/>
-          <w:color w:val="2347C0"/>
-          <w:sz w:val="18"/>
         </w:rPr>
-        <w:t>YOUR EFDS COMMITTEE ACCOUNT</w:t>
+        <w:t>For EFDS committee members and account administrators · September 2026</w:t>
       </w:r>
     </w:p>
     <w:p>
-      <w:pPr>
-        <w:spacing w:after="120"/>
-      </w:pPr>
+      <w:r>
+        <w:t xml:space="preserve">Use your own account. Everyone starts as a </w:t>
+      </w:r>
       <w:r>
         <w:rPr>
           <w:b/>
-          <w:color w:val="15232B"/>
-          <w:sz w:val="46"/>
         </w:rPr>
-        <w:t>Create your sign-in. Connect your role.</w:t>
+        <w:t>member</w:t>
       </w:r>
-    </w:p>
-    <w:p>
-      <w:pPr>
-        <w:spacing w:after="120"/>
-      </w:pPr>
+      <w:r>
+        <w:t xml:space="preserve">, with full event access and public resources. An EFDS administrator can verify society membership, making you an </w:t>
+      </w:r>
       <w:r>
         <w:rPr>
-          <w:b w:val="0"/>
+          <w:b/>
         </w:rPr>
-        <w:t>Each committee member uses a personal account. First sign-in creates member access; an EFDS administrator then grants committee access and links that account to the correct officer roster entry. That link lets the ticket workspace show who owns each task.</w:t>
+        <w:t>EFDS member</w:t>
+      </w:r>
+      <w:r>
+        <w:t xml:space="preserve"> with access to member resources when they are published. Committee access and your officer roster identity are two further, separate steps.</w:t>
       </w:r>
     </w:p>
     <w:p>
       <w:pPr>
         <w:pStyle w:val="Heading2"/>
-        <w:spacing w:before="280" w:after="100"/>
+      </w:pPr>
+      <w:r>
+        <w:t>For committee members</w:t>
+      </w:r>
+    </w:p>
+    <w:p>
+      <w:pPr>
+        <w:pStyle w:val="ListNumber"/>
       </w:pPr>
       <w:r>
         <w:rPr>
-          <w:b w:val="0"/>
+          <w:b/>
         </w:rPr>
-        <w:t>For committee members</w:t>
+        <w:t>Create your account.</w:t>
+      </w:r>
+      <w:r>
+        <w:t xml:space="preserve"> Visit </w:t>
+      </w:r>
+      <w:hyperlink r:id="rId9">
+        <w:r>
+          <w:rPr>
+            <w:color w:val="2540B5"/>
+            <w:u w:val="single"/>
+          </w:rPr>
+          <w:t>imperial-efds.com/login</w:t>
+        </w:r>
+      </w:hyperlink>
+      <w:r>
+        <w:t xml:space="preserve">. Use your own verified </w:t>
+      </w:r>
+      <w:r>
+        <w:rPr>
+          <w:rFonts w:ascii="Aptos Mono" w:hAnsi="Aptos Mono"/>
+          <w:sz w:val="18"/>
+        </w:rPr>
+        <w:t>@imperial.ac.uk</w:t>
+      </w:r>
+      <w:r>
+        <w:t xml:space="preserve"> or </w:t>
+      </w:r>
+      <w:r>
+        <w:rPr>
+          <w:rFonts w:ascii="Aptos Mono" w:hAnsi="Aptos Mono"/>
+          <w:sz w:val="18"/>
+        </w:rPr>
+        <w:t>@ic.ac.uk</w:t>
+      </w:r>
+      <w:r>
+        <w:t xml:space="preserve"> address. If you serve on the committee with a different address, ask an EFDS administrator to approve that address first. Select </w:t>
+      </w:r>
+      <w:r>
+        <w:rPr>
+          <w:b/>
+        </w:rPr>
+        <w:t>First time? Set up password</w:t>
+      </w:r>
+      <w:r>
+        <w:t xml:space="preserve"> and </w:t>
+      </w:r>
+      <w:r>
+        <w:rPr>
+          <w:b/>
+        </w:rPr>
+        <w:t>Send setup email</w:t>
+      </w:r>
+      <w:r>
+        <w:t>. You can also use an email sign-in link, or Google sign-in if its button is available. Microsoft sign-in is not offered.</w:t>
+      </w:r>
+    </w:p>
+    <w:p>
+      <w:pPr>
+        <w:pStyle w:val="ListNumber"/>
+      </w:pPr>
+      <w:r>
+        <w:rPr>
+          <w:b/>
+        </w:rPr>
+        <w:t>Finish from your inbox.</w:t>
+      </w:r>
+      <w:r>
+        <w:t xml:space="preserve"> Open the newest EFDS email, then press </w:t>
+      </w:r>
+      <w:r>
+        <w:rPr>
+          <w:b/>
+        </w:rPr>
+        <w:t>Continue</w:t>
+      </w:r>
+      <w:r>
+        <w:t xml:space="preserve"> on the EFDS confirmation page. Set and confirm a password if prompted. Opening the link alone does not sign you in; the extra step protects against automatic email-security scans. If the link has expired, request a new one. Do not share it.</w:t>
+      </w:r>
+    </w:p>
+    <w:p>
+      <w:pPr>
+        <w:pStyle w:val="ListNumber"/>
+      </w:pPr>
+      <w:r>
+        <w:rPr>
+          <w:b/>
+        </w:rPr>
+        <w:t>Request society verification.</w:t>
+      </w:r>
+      <w:r>
+        <w:t xml:space="preserve"> Open </w:t>
+      </w:r>
+      <w:hyperlink r:id="rId10">
+        <w:r>
+          <w:rPr>
+            <w:color w:val="2540B5"/>
+            <w:u w:val="single"/>
+          </w:rPr>
+          <w:t>Your profile</w:t>
+        </w:r>
+      </w:hyperlink>
+      <w:r>
+        <w:t xml:space="preserve">. Under </w:t>
+      </w:r>
+      <w:r>
+        <w:rPr>
+          <w:b/>
+        </w:rPr>
+        <w:t>EFDS membership</w:t>
+      </w:r>
+      <w:r>
+        <w:t xml:space="preserve">, describe how you are connected to the society and select </w:t>
+      </w:r>
+      <w:r>
+        <w:rPr>
+          <w:b/>
+        </w:rPr>
+        <w:t>Send for review</w:t>
+      </w:r>
+      <w:r>
+        <w:t>. Your university email confirms affiliation with Imperial, but does not by itself prove society membership. Your member account still has full event access while the review is pending.</w:t>
+      </w:r>
+    </w:p>
+    <w:p>
+      <w:pPr>
+        <w:pStyle w:val="ListNumber"/>
+      </w:pPr>
+      <w:r>
+        <w:rPr>
+          <w:b/>
+        </w:rPr>
+        <w:t>Tell the administrator your committee identity.</w:t>
+      </w:r>
+      <w:r>
+        <w:t xml:space="preserve"> In your usual committee channel, share your full name, the exact account email, your official committee title and academic year. Never share a password, email sign-in link or reset code.</w:t>
+      </w:r>
+    </w:p>
+    <w:p>
+      <w:pPr>
+        <w:pStyle w:val="ListNumber"/>
+      </w:pPr>
+      <w:r>
+        <w:rPr>
+          <w:b/>
+        </w:rPr>
+        <w:t>Check your access.</w:t>
+      </w:r>
+      <w:r>
+        <w:t xml:space="preserve"> After an administrator confirms verification, committee access and your officer link, refresh </w:t>
+      </w:r>
+      <w:hyperlink r:id="rId10">
+        <w:r>
+          <w:rPr>
+            <w:color w:val="2540B5"/>
+            <w:u w:val="single"/>
+          </w:rPr>
+          <w:t>Your profile</w:t>
+        </w:r>
+      </w:hyperlink>
+      <w:r>
+        <w:t xml:space="preserve">. It should show </w:t>
+      </w:r>
+      <w:r>
+        <w:rPr>
+          <w:b/>
+        </w:rPr>
+        <w:t>Committee</w:t>
+      </w:r>
+      <w:r>
+        <w:t xml:space="preserve"> and the correct name, title and academic year. Open </w:t>
+      </w:r>
+      <w:hyperlink r:id="rId11">
+        <w:r>
+          <w:rPr>
+            <w:color w:val="2540B5"/>
+            <w:u w:val="single"/>
+          </w:rPr>
+          <w:t>Tickets</w:t>
+        </w:r>
+      </w:hyperlink>
+      <w:r>
+        <w:t xml:space="preserve"> to see committee work. Ask the administrator to correct any mismatch; do not create a second account.</w:t>
+      </w:r>
+    </w:p>
+    <w:p>
+      <w:r>
+        <w:rPr>
+          <w:b/>
+        </w:rPr>
+        <w:t>Keep one account.</w:t>
+      </w:r>
+      <w:r>
+        <w:t xml:space="preserve"> Signing in with a different email can create a separate identity. The account and officer roster entry are what connect you to ticket assignments.</w:t>
+      </w:r>
+    </w:p>
+    <w:p>
+      <w:pPr>
+        <w:pStyle w:val="Heading2"/>
+      </w:pPr>
+      <w:r>
+        <w:t>For EFDS account administrators</w:t>
+      </w:r>
+    </w:p>
+    <w:p>
+      <w:r>
+        <w:t xml:space="preserve">Use the </w:t>
+      </w:r>
+      <w:hyperlink r:id="rId12">
+        <w:r>
+          <w:rPr>
+            <w:color w:val="2540B5"/>
+            <w:u w:val="single"/>
+          </w:rPr>
+          <w:t>Accounts review panel</w:t>
+        </w:r>
+      </w:hyperlink>
+      <w:r>
+        <w:t xml:space="preserve"> after the person signs in once. Check the current society or committee record through a trusted source. A name, student email or self-description alone is not sufficient evidence. The panel records the acting admin, decision, reason and date. It prevents direct role changes, stale edits and two active accounts linking to the same officer entry.</w:t>
+      </w:r>
+    </w:p>
+    <w:p>
+      <w:pPr>
+        <w:pStyle w:val="ListNumber"/>
+      </w:pPr>
+      <w:r>
+        <w:rPr>
+          <w:b/>
+        </w:rPr>
+        <w:t>Verify EFDS membership.</w:t>
+      </w:r>
+      <w:r>
+        <w:t xml:space="preserve"> In </w:t>
+      </w:r>
+      <w:r>
+        <w:rPr>
+          <w:b/>
+        </w:rPr>
+        <w:t>Needs review</w:t>
+      </w:r>
+      <w:r>
+        <w:t xml:space="preserve">, open the person's exact account. Compare their claim with an independent EFDS record. Select </w:t>
+      </w:r>
+      <w:r>
+        <w:rPr>
+          <w:b/>
+        </w:rPr>
+        <w:t>Verify EFDS membership</w:t>
+      </w:r>
+      <w:r>
+        <w:t xml:space="preserve"> and record the source checked in </w:t>
+      </w:r>
+      <w:r>
+        <w:rPr>
+          <w:b/>
+        </w:rPr>
+        <w:t>Reason</w:t>
+      </w:r>
+      <w:r>
+        <w:t xml:space="preserve">. If the claim cannot be confirmed, select </w:t>
+      </w:r>
+      <w:r>
+        <w:rPr>
+          <w:b/>
+        </w:rPr>
+        <w:t>Decline verification</w:t>
+      </w:r>
+      <w:r>
+        <w:t>, explain why and ask the person for corrected details. A declined account remains visible for follow-up.</w:t>
+      </w:r>
+    </w:p>
+    <w:p>
+      <w:pPr>
+        <w:pStyle w:val="ListNumber"/>
+      </w:pPr>
+      <w:r>
+        <w:rPr>
+          <w:b/>
+        </w:rPr>
+        <w:t>Grant committee access.</w:t>
+      </w:r>
+      <w:r>
+        <w:t xml:space="preserve"> After verification, switch to </w:t>
+      </w:r>
+      <w:r>
+        <w:rPr>
+          <w:b/>
+        </w:rPr>
+        <w:t>All active accounts</w:t>
+      </w:r>
+      <w:r>
+        <w:t xml:space="preserve">, find that account, select </w:t>
+      </w:r>
+      <w:r>
+        <w:rPr>
+          <w:b/>
+        </w:rPr>
+        <w:t>Grant committee access</w:t>
+      </w:r>
+      <w:r>
+        <w:t>, state the reason and save. Verification and promotion are deliberately separate decisions.</w:t>
+      </w:r>
+    </w:p>
+    <w:p>
+      <w:pPr>
+        <w:pStyle w:val="ListNumber"/>
+      </w:pPr>
+      <w:r>
+        <w:rPr>
+          <w:b/>
+        </w:rPr>
+        <w:t>Link the correct officer entry.</w:t>
+      </w:r>
+      <w:r>
+        <w:t xml:space="preserve"> On the same account, select </w:t>
+      </w:r>
+      <w:r>
+        <w:rPr>
+          <w:b/>
+        </w:rPr>
+        <w:t>Link committee identity</w:t>
+      </w:r>
+      <w:r>
+        <w:t xml:space="preserve"> and choose the active officer roster entry with the correct full name, title and academic year. Check </w:t>
+      </w:r>
+      <w:hyperlink r:id="rId13">
+        <w:r>
+          <w:rPr>
+            <w:color w:val="2540B5"/>
+            <w:u w:val="single"/>
+          </w:rPr>
+          <w:t>Admin → Committee</w:t>
+        </w:r>
+      </w:hyperlink>
+      <w:r>
+        <w:t xml:space="preserve"> if a roster entry is missing or already linked. The database refuses a duplicate active link.</w:t>
+      </w:r>
+    </w:p>
+    <w:p>
+      <w:pPr>
+        <w:pStyle w:val="ListNumber"/>
+      </w:pPr>
+      <w:r>
+        <w:rPr>
+          <w:b/>
+        </w:rPr>
+        <w:t>Check the outcome.</w:t>
+      </w:r>
+      <w:r>
+        <w:t xml:space="preserve"> Ask the member to refresh their profile and ticket dashboard. Use the account panel's recent access decisions to confirm what changed and when. Admin promotion also requires a reason and cannot be applied to an unverified account. An admin cannot change their own role or remove the last active admin.</w:t>
+      </w:r>
+    </w:p>
+    <w:p>
+      <w:r>
+        <w:t xml:space="preserve">The old </w:t>
+      </w:r>
+      <w:r>
+        <w:rPr>
+          <w:rFonts w:ascii="Aptos Mono" w:hAnsi="Aptos Mono"/>
+          <w:sz w:val="18"/>
+        </w:rPr>
+        <w:t>grant_access.py</w:t>
+      </w:r>
+      <w:r>
+        <w:t xml:space="preserve"> database command remains a bootstrap or recovery tool for an authorised operator; routine account reviews now belong in the audited dashboard. Do not put database credentials in a command, shared document or chat.</w:t>
+      </w:r>
+    </w:p>
+    <w:p>
+      <w:pPr>
+        <w:pStyle w:val="Heading2"/>
+      </w:pPr>
+      <w:r>
+        <w:t>If something does not work</w:t>
       </w:r>
     </w:p>
     <w:tbl>
       <w:tblPr>
+        <w:tblStyle w:val="TableGrid"/>
         <w:tblW w:type="auto" w:w="0"/>
-        <w:tblLayout w:type="fixed"/>
+        <w:jc w:val="center"/>
         <w:tblLook w:firstColumn="1" w:firstRow="1" w:lastColumn="0" w:lastRow="0" w:noHBand="0" w:noVBand="1" w:val="04A0"/>
       </w:tblPr>
       <w:tblGrid>
-        <w:gridCol w:w="677"/>
-        <w:gridCol w:w="9317"/>
+        <w:gridCol w:w="4939"/>
+        <w:gridCol w:w="4939"/>
       </w:tblGrid>
       <w:tr>
         <w:tc>
           <w:tcPr>
-            <w:tcW w:type="dxa" w:w="677"/>
-            <w:vAlign w:val="center"/>
-            <w:shd w:fill="2347C0"/>
+            <w:tcW w:type="dxa" w:w="4939"/>
           </w:tcPr>
           <w:p>
-            <w:pPr>
-              <w:jc w:val="center"/>
-            </w:pPr>
             <w:r>
               <w:rPr>
                 <w:b/>
-                <w:color w:val="FFFFFF"/>
-                <w:sz w:val="20"/>
               </w:rPr>
-              <w:t>01</w:t>
+              <w:t>What you see</w:t>
             </w:r>
           </w:p>
         </w:tc>
         <w:tc>
           <w:tcPr>
-            <w:tcW w:type="dxa" w:w="9317"/>
+            <w:tcW w:type="dxa" w:w="4939"/>
           </w:tcPr>
           <w:p>
-            <w:pPr>
-              <w:spacing w:after="0"/>
-            </w:pPr>
             <w:r>
               <w:rPr>
                 <w:b/>
-                <w:color w:val="15232B"/>
               </w:rPr>
-              <w:t xml:space="preserve">Open EFDS sign-in.  </w:t>
-            </w:r>
-            <w:r>
-              <w:rPr>
-                <w:b w:val="0"/>
-              </w:rPr>
-              <w:t>Go to www.imperial-efds.com/login. Use your own verified @imperial.ac.uk or @ic.ac.uk address. If you use another address, ask the EFDS administrator to approve it first.</w:t>
+              <w:t>What to do</w:t>
             </w:r>
           </w:p>
         </w:tc>
       </w:tr>
-    </w:tbl>
-    <w:p>
-      <w:pPr>
-        <w:spacing w:after="0"/>
-      </w:pPr>
-    </w:p>
-    <w:tbl>
-      <w:tblPr>
-        <w:tblW w:type="auto" w:w="0"/>
-        <w:tblLayout w:type="fixed"/>
-        <w:tblLook w:firstColumn="1" w:firstRow="1" w:lastColumn="0" w:lastRow="0" w:noHBand="0" w:noVBand="1" w:val="04A0"/>
-      </w:tblPr>
-      <w:tblGrid>
-        <w:gridCol w:w="677"/>
-        <w:gridCol w:w="9317"/>
-      </w:tblGrid>
       <w:tr>
         <w:tc>
           <w:tcPr>
-            <w:tcW w:type="dxa" w:w="677"/>
-            <w:vAlign w:val="center"/>
-            <w:shd w:fill="2347C0"/>
+            <w:tcW w:type="dxa" w:w="4939"/>
           </w:tcPr>
           <w:p>
-            <w:pPr>
-              <w:jc w:val="center"/>
-            </w:pPr>
             <w:r>
-              <w:rPr>
-                <w:b/>
-                <w:color w:val="FFFFFF"/>
-                <w:sz w:val="20"/>
-              </w:rPr>
-              <w:t>02</w:t>
+              <w:t>No email arrives</w:t>
             </w:r>
           </w:p>
         </w:tc>
         <w:tc>
           <w:tcPr>
-            <w:tcW w:type="dxa" w:w="9317"/>
+            <w:tcW w:type="dxa" w:w="4939"/>
           </w:tcPr>
           <w:p>
-            <w:pPr>
-              <w:spacing w:after="0"/>
-            </w:pPr>
             <w:r>
-              <w:rPr>
-                <w:b/>
-                <w:color w:val="15232B"/>
-              </w:rPr>
-              <w:t xml:space="preserve">Set up your sign-in.  </w:t>
-            </w:r>
-            <w:r>
-              <w:rPr>
-                <w:b w:val="0"/>
-              </w:rPr>
-              <w:t>Select “First time? Set up password”, enter that same email, then select “Send setup email”. You can instead choose “Sign in by email link”. If Google says “being configured”, use email. Microsoft sign-in is no longer offered on the site.</w:t>
+              <w:t>Check junk mail, confirm the address, wait a few minutes, then request a new email. Ask an admin to inspect delivery health if it still fails.</w:t>
             </w:r>
           </w:p>
         </w:tc>
       </w:tr>
-    </w:tbl>
-    <w:p>
-      <w:pPr>
-        <w:spacing w:after="0"/>
-      </w:pPr>
-    </w:p>
-    <w:tbl>
-      <w:tblPr>
-        <w:tblW w:type="auto" w:w="0"/>
-        <w:tblLayout w:type="fixed"/>
-        <w:tblLook w:firstColumn="1" w:firstRow="1" w:lastColumn="0" w:lastRow="0" w:noHBand="0" w:noVBand="1" w:val="04A0"/>
-      </w:tblPr>
-      <w:tblGrid>
-        <w:gridCol w:w="677"/>
-        <w:gridCol w:w="9317"/>
-      </w:tblGrid>
       <w:tr>
         <w:tc>
           <w:tcPr>
-            <w:tcW w:type="dxa" w:w="677"/>
-            <w:vAlign w:val="center"/>
-            <w:shd w:fill="2347C0"/>
+            <w:tcW w:type="dxa" w:w="4939"/>
           </w:tcPr>
           <w:p>
-            <w:pPr>
-              <w:jc w:val="center"/>
-            </w:pPr>
             <w:r>
-              <w:rPr>
-                <w:b/>
-                <w:color w:val="FFFFFF"/>
-                <w:sz w:val="20"/>
-              </w:rPr>
-              <w:t>03</w:t>
+              <w:t>The link opens the homepage or says expired</w:t>
             </w:r>
           </w:p>
         </w:tc>
         <w:tc>
           <w:tcPr>
-            <w:tcW w:type="dxa" w:w="9317"/>
+            <w:tcW w:type="dxa" w:w="4939"/>
           </w:tcPr>
           <w:p>
-            <w:pPr>
-              <w:spacing w:after="0"/>
-            </w:pPr>
             <w:r>
-              <w:rPr>
-                <w:b/>
-                <w:color w:val="15232B"/>
-              </w:rPr>
-              <w:t xml:space="preserve">Finish from your inbox.  </w:t>
-            </w:r>
-            <w:r>
-              <w:rPr>
-                <w:b w:val="0"/>
-              </w:rPr>
-              <w:t>Open the newest EFDS email on the same device and browser, follow the link, then set and confirm your password if prompted. If the link has expired or was already used, request a new one. Check junk mail if no message arrives.</w:t>
+              <w:t>Request a fresh link and open the newest one. Send an admin the error text, never the link or its code.</w:t>
             </w:r>
           </w:p>
         </w:tc>
       </w:tr>
-    </w:tbl>
-    <w:p>
-      <w:pPr>
-        <w:spacing w:after="0"/>
-      </w:pPr>
-    </w:p>
-    <w:tbl>
-      <w:tblPr>
-        <w:tblW w:type="auto" w:w="0"/>
-        <w:tblLayout w:type="fixed"/>
-        <w:tblLook w:firstColumn="1" w:firstRow="1" w:lastColumn="0" w:lastRow="0" w:noHBand="0" w:noVBand="1" w:val="04A0"/>
-      </w:tblPr>
-      <w:tblGrid>
-        <w:gridCol w:w="677"/>
-        <w:gridCol w:w="9317"/>
-      </w:tblGrid>
       <w:tr>
         <w:tc>
           <w:tcPr>
-            <w:tcW w:type="dxa" w:w="677"/>
-            <w:vAlign w:val="center"/>
-            <w:shd w:fill="2347C0"/>
+            <w:tcW w:type="dxa" w:w="4939"/>
           </w:tcPr>
           <w:p>
-            <w:pPr>
-              <w:jc w:val="center"/>
-            </w:pPr>
             <w:r>
-              <w:rPr>
-                <w:b/>
-                <w:color w:val="FFFFFF"/>
-                <w:sz w:val="20"/>
-              </w:rPr>
-              <w:t>04</w:t>
+              <w:t>You can sign in, but only see member access</w:t>
             </w:r>
           </w:p>
         </w:tc>
         <w:tc>
           <w:tcPr>
-            <w:tcW w:type="dxa" w:w="9317"/>
+            <w:tcW w:type="dxa" w:w="4939"/>
           </w:tcPr>
           <w:p>
-            <w:pPr>
-              <w:spacing w:after="0"/>
-            </w:pPr>
             <w:r>
-              <w:rPr>
-                <w:b/>
-                <w:color w:val="15232B"/>
-              </w:rPr>
-              <w:t xml:space="preserve">Ask for committee access.  </w:t>
-            </w:r>
-            <w:r>
-              <w:rPr>
-                <w:b w:val="0"/>
-              </w:rPr>
-              <w:t>Through your usual committee channel, tell the EFDS administrator your full name, exact signed-in email, official committee title, and academic year. “Member access” before promotion is expected. Never share a password or sign-in link.</w:t>
+              <w:t>Complete the EFDS membership request on your profile; ask an admin to review the exact account email.</w:t>
             </w:r>
           </w:p>
         </w:tc>
       </w:tr>
-    </w:tbl>
-    <w:p>
-      <w:pPr>
-        <w:spacing w:after="0"/>
-      </w:pPr>
-    </w:p>
-    <w:tbl>
-      <w:tblPr>
-        <w:tblW w:type="auto" w:w="0"/>
-        <w:tblLayout w:type="fixed"/>
-        <w:tblLook w:firstColumn="1" w:firstRow="1" w:lastColumn="0" w:lastRow="0" w:noHBand="0" w:noVBand="1" w:val="04A0"/>
-      </w:tblPr>
-      <w:tblGrid>
-        <w:gridCol w:w="677"/>
-        <w:gridCol w:w="9317"/>
-      </w:tblGrid>
       <w:tr>
         <w:tc>
           <w:tcPr>
-            <w:tcW w:type="dxa" w:w="677"/>
-            <w:vAlign w:val="center"/>
-            <w:shd w:fill="2347C0"/>
+            <w:tcW w:type="dxa" w:w="4939"/>
           </w:tcPr>
           <w:p>
-            <w:pPr>
-              <w:jc w:val="center"/>
-            </w:pPr>
             <w:r>
-              <w:rPr>
-                <w:b/>
-                <w:color w:val="FFFFFF"/>
-                <w:sz w:val="20"/>
-              </w:rPr>
-              <w:t>05</w:t>
+              <w:t>EFDS member access is active, but Tickets is missing</w:t>
             </w:r>
           </w:p>
         </w:tc>
         <w:tc>
           <w:tcPr>
-            <w:tcW w:type="dxa" w:w="9317"/>
+            <w:tcW w:type="dxa" w:w="4939"/>
           </w:tcPr>
           <w:p>
-            <w:pPr>
-              <w:spacing w:after="0"/>
-            </w:pPr>
             <w:r>
-              <w:rPr>
-                <w:b/>
-                <w:color w:val="15232B"/>
-              </w:rPr>
-              <w:t xml:space="preserve">Verify your role.  </w:t>
-            </w:r>
-            <w:r>
-              <w:rPr>
-                <w:b w:val="0"/>
-              </w:rPr>
-              <w:t>After the administrator confirms, refresh or sign in again. At www.imperial-efds.com/dashboard/profile, check for “committee access” plus your linked name, title, and year. Open /dashboard/tickets to see committee work. Report any mismatch.</w:t>
+              <w:t>Ask an admin to grant committee access and link your roster identity.</w:t>
             </w:r>
           </w:p>
         </w:tc>
       </w:tr>
-    </w:tbl>
-    <w:p>
-      <w:pPr>
-        <w:spacing w:after="0"/>
-      </w:pPr>
-    </w:p>
-    <w:tbl>
-      <w:tblPr>
-        <w:tblW w:type="auto" w:w="0"/>
-        <w:tblLook w:firstColumn="1" w:firstRow="1" w:lastColumn="0" w:lastRow="0" w:noHBand="0" w:noVBand="1" w:val="04A0"/>
-      </w:tblPr>
-      <w:tblGrid>
-        <w:gridCol w:w="10166"/>
-      </w:tblGrid>
       <w:tr>
         <w:tc>
           <w:tcPr>
-            <w:tcW w:type="dxa" w:w="10166"/>
-            <w:shd w:fill="F2F5FC"/>
+            <w:tcW w:type="dxa" w:w="4939"/>
           </w:tcPr>
           <w:p>
-            <w:pPr>
-              <w:spacing w:after="0"/>
-            </w:pPr>
+            <w:r>
+              <w:t>Committee access appears, but your title is wrong</w:t>
+            </w:r>
+          </w:p>
+        </w:tc>
+        <w:tc>
+          <w:tcPr>
+            <w:tcW w:type="dxa" w:w="4939"/>
+          </w:tcPr>
+          <w:p>
+            <w:r>
+              <w:t>Ask an admin to correct the officer link. Do not make another account.</w:t>
+            </w:r>
+          </w:p>
+        </w:tc>
+      </w:tr>
+      <w:tr>
+        <w:tc>
+          <w:tcPr>
+            <w:tcW w:type="dxa" w:w="4939"/>
+          </w:tcPr>
+          <w:p>
+            <w:r>
+              <w:t>Password sign-in fails</w:t>
+            </w:r>
+          </w:p>
+        </w:tc>
+        <w:tc>
+          <w:tcPr>
+            <w:tcW w:type="dxa" w:w="4939"/>
+          </w:tcPr>
+          <w:p>
+            <w:r>
+              <w:t xml:space="preserve">Use </w:t>
+            </w:r>
             <w:r>
               <w:rPr>
-                <w:b w:val="0"/>
-                <w:color w:val="15232B"/>
+                <w:b/>
               </w:rPr>
-              <w:t>Use the same email every time. A different email or Google identity can create a separate account. Ticket assignments follow the officer entry linked to your account.</w:t>
+              <w:t>Forgot password?</w:t>
+            </w:r>
+            <w:r>
+              <w:t xml:space="preserve"> or an email sign-in link.</w:t>
+            </w:r>
+          </w:p>
+        </w:tc>
+      </w:tr>
+      <w:tr>
+        <w:tc>
+          <w:tcPr>
+            <w:tcW w:type="dxa" w:w="4939"/>
+          </w:tcPr>
+          <w:p>
+            <w:r>
+              <w:t>Google sign-in is unavailable</w:t>
+            </w:r>
+          </w:p>
+        </w:tc>
+        <w:tc>
+          <w:tcPr>
+            <w:tcW w:type="dxa" w:w="4939"/>
+          </w:tcPr>
+          <w:p>
+            <w:r>
+              <w:t>Use email sign-in. Google requires separate provider configuration.</w:t>
             </w:r>
           </w:p>
         </w:tc>
@@ -387,364 +636,13 @@
     </w:tbl>
     <w:p>
       <w:r>
-        <w:br w:type="page"/>
-      </w:r>
-    </w:p>
-    <w:p>
-      <w:pPr>
-        <w:pStyle w:val="Heading2"/>
-        <w:spacing w:before="280" w:after="100"/>
-      </w:pPr>
-      <w:r>
-        <w:rPr>
-          <w:b w:val="0"/>
-        </w:rPr>
-        <w:t>For the EFDS account administrator</w:t>
-      </w:r>
-    </w:p>
-    <w:p>
-      <w:pPr>
-        <w:spacing w:after="120"/>
-      </w:pPr>
-      <w:r>
-        <w:rPr>
-          <w:b w:val="0"/>
-        </w:rPr>
-        <w:t>Verify the person against the current committee roster and a trusted committee channel. Promotion happens only after they have signed in once. Use the knowledge-base backend with its already configured DATABASE_URL; never place a database credential in a command or shared guide.</w:t>
-      </w:r>
-    </w:p>
-    <w:p>
-      <w:pPr>
-        <w:spacing w:after="120"/>
-      </w:pPr>
-      <w:r>
-        <w:rPr>
-          <w:b/>
-        </w:rPr>
-        <w:t xml:space="preserve">1  Check the profile and roster. </w:t>
-      </w:r>
-      <w:r>
-        <w:rPr>
-          <w:b w:val="0"/>
-        </w:rPr>
-        <w:t>On www.imperial-efds.com/admin/committee, confirm that the person signed in with the claimed email and the active officers roster has the correct full name, title, and year. Correct a missing or wrong roster entry first.</w:t>
-      </w:r>
-    </w:p>
-    <w:p>
-      <w:pPr>
-        <w:spacing w:after="120"/>
-      </w:pPr>
-      <w:r>
-        <w:rPr>
-          <w:b/>
-        </w:rPr>
-        <w:t xml:space="preserve">2  Grant committee access and link the roster identity. </w:t>
-      </w:r>
-      <w:r>
-        <w:rPr>
-          <w:b w:val="0"/>
-        </w:rPr>
-        <w:t>From the efds-knowledge-base directory, in its configured Python environment, run:</w:t>
-      </w:r>
-    </w:p>
-    <w:tbl>
-      <w:tblPr>
-        <w:tblW w:type="auto" w:w="0"/>
-        <w:tblLook w:firstColumn="1" w:firstRow="1" w:lastColumn="0" w:lastRow="0" w:noHBand="0" w:noVBand="1" w:val="04A0"/>
-      </w:tblPr>
-      <w:tblGrid>
-        <w:gridCol w:w="10166"/>
-      </w:tblGrid>
-      <w:tr>
-        <w:tc>
-          <w:tcPr>
-            <w:tcW w:type="dxa" w:w="10166"/>
-            <w:shd w:fill="15232B"/>
-          </w:tcPr>
-          <w:p>
-            <w:r>
-              <w:rPr>
-                <w:b w:val="0"/>
-                <w:color w:val="FFFFFF"/>
-                <w:sz w:val="17"/>
-              </w:rPr>
-              <w:t>python scripts/grant_access.py person@imperial.ac.uk \</w:t>
-            </w:r>
-          </w:p>
-          <w:p>
-            <w:r>
-              <w:rPr>
-                <w:b w:val="0"/>
-                <w:color w:val="FFFFFF"/>
-                <w:sz w:val="17"/>
-              </w:rPr>
-              <w:t xml:space="preserve">  --role committee --officer-name "Full Roster Name"</w:t>
-            </w:r>
-          </w:p>
-        </w:tc>
-      </w:tr>
-    </w:tbl>
-    <w:p>
-      <w:pPr>
-        <w:spacing w:after="120"/>
-      </w:pPr>
-      <w:r>
-        <w:rPr>
-          <w:b w:val="0"/>
-        </w:rPr>
-        <w:t>Use the exact signed-in email and roster name. If the name repeats across years, add --academic-year "2026/27" with the actual roster year. The command refuses an ambiguous name or a roster entry already linked to another active account.</w:t>
-      </w:r>
-    </w:p>
-    <w:p>
-      <w:pPr>
-        <w:spacing w:after="120"/>
-      </w:pPr>
-      <w:r>
-        <w:rPr>
-          <w:b/>
-        </w:rPr>
-        <w:t xml:space="preserve">3  Verify the result. </w:t>
-      </w:r>
-      <w:r>
-        <w:rPr>
-          <w:b w:val="0"/>
-        </w:rPr>
-        <w:t>Check that the output names the right email, officer title, and year. Ask the member to refresh or sign in again and inspect their Profile and Tickets. Repeating the same grant is safe.</w:t>
-      </w:r>
-    </w:p>
-    <w:p>
-      <w:pPr>
-        <w:pStyle w:val="Heading2"/>
-        <w:spacing w:before="280" w:after="100"/>
-      </w:pPr>
-      <w:r>
-        <w:rPr>
-          <w:b w:val="0"/>
-        </w:rPr>
-        <w:t>Quick fixes</w:t>
-      </w:r>
-    </w:p>
-    <w:tbl>
-      <w:tblPr>
-        <w:tblW w:type="auto" w:w="0"/>
-        <w:tblLayout w:type="fixed"/>
-        <w:tblLook w:firstColumn="1" w:firstRow="1" w:lastColumn="0" w:lastRow="0" w:noHBand="0" w:noVBand="1" w:val="04A0"/>
-      </w:tblPr>
-      <w:tblGrid>
-        <w:gridCol w:w="2664"/>
-        <w:gridCol w:w="7272"/>
-      </w:tblGrid>
-      <w:tr>
-        <w:tc>
-          <w:tcPr>
-            <w:tcW w:type="dxa" w:w="2664"/>
-            <w:vAlign w:val="center"/>
-            <w:shd w:fill="F2F5FC"/>
-          </w:tcPr>
-          <w:p>
-            <w:r>
-              <w:rPr>
-                <w:b/>
-                <w:color w:val="15232B"/>
-              </w:rPr>
-              <w:t>No email arrives</w:t>
-            </w:r>
-          </w:p>
-        </w:tc>
-        <w:tc>
-          <w:tcPr>
-            <w:tcW w:type="dxa" w:w="7272"/>
-            <w:vAlign w:val="center"/>
-            <w:shd w:fill="F2F5FC"/>
-          </w:tcPr>
-          <w:p>
-            <w:r>
-              <w:rPr>
-                <w:b w:val="0"/>
-              </w:rPr>
-              <w:t>Check junk mail and the address; request a fresh setup email. Ask the admin to check delivery if it still fails.</w:t>
-            </w:r>
-          </w:p>
-        </w:tc>
-      </w:tr>
-      <w:tr>
-        <w:tc>
-          <w:tcPr>
-            <w:tcW w:type="dxa" w:w="2664"/>
-            <w:vAlign w:val="center"/>
-          </w:tcPr>
-          <w:p>
-            <w:r>
-              <w:rPr>
-                <w:b/>
-                <w:color w:val="15232B"/>
-              </w:rPr>
-              <w:t>Link lands on home or expires</w:t>
-            </w:r>
-          </w:p>
-        </w:tc>
-        <w:tc>
-          <w:tcPr>
-            <w:tcW w:type="dxa" w:w="7272"/>
-            <w:vAlign w:val="center"/>
-          </w:tcPr>
-          <w:p>
-            <w:r>
-              <w:rPr>
-                <w:b w:val="0"/>
-              </w:rPr>
-              <w:t>Request a new link; use the newest one in the same browser. Share only the error text, never the link or code.</w:t>
-            </w:r>
-          </w:p>
-        </w:tc>
-      </w:tr>
-      <w:tr>
-        <w:tc>
-          <w:tcPr>
-            <w:tcW w:type="dxa" w:w="2664"/>
-            <w:vAlign w:val="center"/>
-            <w:shd w:fill="F2F5FC"/>
-          </w:tcPr>
-          <w:p>
-            <w:r>
-              <w:rPr>
-                <w:b/>
-                <w:color w:val="15232B"/>
-              </w:rPr>
-              <w:t>Still member access</w:t>
-            </w:r>
-          </w:p>
-        </w:tc>
-        <w:tc>
-          <w:tcPr>
-            <w:tcW w:type="dxa" w:w="7272"/>
-            <w:vAlign w:val="center"/>
-            <w:shd w:fill="F2F5FC"/>
-          </w:tcPr>
-          <w:p>
-            <w:r>
-              <w:rPr>
-                <w:b w:val="0"/>
-              </w:rPr>
-              <w:t>Admin: promote the exact signed-in email. First sign-in never grants committee status automatically.</w:t>
-            </w:r>
-          </w:p>
-        </w:tc>
-      </w:tr>
-      <w:tr>
-        <w:tc>
-          <w:tcPr>
-            <w:tcW w:type="dxa" w:w="2664"/>
-            <w:vAlign w:val="center"/>
-          </w:tcPr>
-          <w:p>
-            <w:r>
-              <w:rPr>
-                <w:b/>
-                <w:color w:val="15232B"/>
-              </w:rPr>
-              <w:t>Wrong or missing title</w:t>
-            </w:r>
-          </w:p>
-        </w:tc>
-        <w:tc>
-          <w:tcPr>
-            <w:tcW w:type="dxa" w:w="7272"/>
-            <w:vAlign w:val="center"/>
-          </w:tcPr>
-          <w:p>
-            <w:r>
-              <w:rPr>
-                <w:b w:val="0"/>
-              </w:rPr>
-              <w:t>Admin: correct the officer roster link. Member: do not create a second account.</w:t>
-            </w:r>
-          </w:p>
-        </w:tc>
-      </w:tr>
-      <w:tr>
-        <w:tc>
-          <w:tcPr>
-            <w:tcW w:type="dxa" w:w="2664"/>
-            <w:vAlign w:val="center"/>
-            <w:shd w:fill="F2F5FC"/>
-          </w:tcPr>
-          <w:p>
-            <w:r>
-              <w:rPr>
-                <w:b/>
-                <w:color w:val="15232B"/>
-              </w:rPr>
-              <w:t>Password fails</w:t>
-            </w:r>
-          </w:p>
-        </w:tc>
-        <w:tc>
-          <w:tcPr>
-            <w:tcW w:type="dxa" w:w="7272"/>
-            <w:vAlign w:val="center"/>
-            <w:shd w:fill="F2F5FC"/>
-          </w:tcPr>
-          <w:p>
-            <w:r>
-              <w:rPr>
-                <w:b w:val="0"/>
-              </w:rPr>
-              <w:t>Use “Forgot password?” or “Sign in by email link”.</w:t>
-            </w:r>
-          </w:p>
-        </w:tc>
-      </w:tr>
-      <w:tr>
-        <w:tc>
-          <w:tcPr>
-            <w:tcW w:type="dxa" w:w="2664"/>
-            <w:vAlign w:val="center"/>
-          </w:tcPr>
-          <w:p>
-            <w:r>
-              <w:rPr>
-                <w:b/>
-                <w:color w:val="15232B"/>
-              </w:rPr>
-              <w:t>Google unavailable</w:t>
-            </w:r>
-          </w:p>
-        </w:tc>
-        <w:tc>
-          <w:tcPr>
-            <w:tcW w:type="dxa" w:w="7272"/>
-            <w:vAlign w:val="center"/>
-          </w:tcPr>
-          <w:p>
-            <w:r>
-              <w:rPr>
-                <w:b w:val="0"/>
-              </w:rPr>
-              <w:t>Use email. Google sign-in requires separate provider setup before activation.</w:t>
-            </w:r>
-          </w:p>
-        </w:tc>
-      </w:tr>
-    </w:tbl>
-    <w:p>
-      <w:pPr>
-        <w:spacing w:after="120" w:before="160"/>
-      </w:pPr>
-      <w:r>
-        <w:rPr>
-          <w:b w:val="0"/>
-          <w:color w:val="52616A"/>
-          <w:sz w:val="16"/>
-        </w:rPr>
-        <w:t>EFDS is a student society. Its account access is managed by the society and is separate from Imperial College London’s own account permissions.</w:t>
+        <w:t>EFDS is a student society. Its account access is managed by the society and is separate from Imperial College London's account permissions.</w:t>
       </w:r>
     </w:p>
     <w:sectPr>
-      <w:headerReference w:type="default" r:id="rId9"/>
-      <w:footerReference w:type="default" r:id="rId10"/>
+      <w:footerReference w:type="default" r:id="rId14"/>
       <w:pgSz w:w="12240" w:h="15840"/>
-      <w:pgMar w:top="950" w:right="1037" w:bottom="864" w:left="1037" w:header="374" w:footer="432" w:gutter="0"/>
+      <w:pgMar w:top="1080" w:right="1181" w:bottom="1008" w:left="1181" w:header="720" w:footer="720" w:gutter="0"/>
       <w:cols w:space="720"/>
       <w:docGrid w:linePitch="360"/>
     </w:sectPr>
@@ -761,36 +659,13 @@
     </w:pPr>
     <w:r>
       <w:rPr>
-        <w:b w:val="0"/>
-        <w:color w:val="52616A"/>
-        <w:sz w:val="14"/>
-      </w:rPr>
-      <w:t>Economics, Finance &amp; Data Science Society  ·  September 2026</w:t>
+        <w:color w:val="5A687B"/>
+        <w:sz w:val="16"/>
+      </w:rPr>
+      <w:t>EFDS  ·  Committee account guide  ·  September 2026</w:t>
     </w:r>
   </w:p>
 </w:ftr>
-</file>
-
-<file path=word/header1.xml><?xml version="1.0" encoding="utf-8"?>
-<w:hdr xmlns:m="http://schemas.openxmlformats.org/officeDocument/2006/math" xmlns:mc="http://schemas.openxmlformats.org/markup-compatibility/2006" xmlns:mo="http://schemas.microsoft.com/office/mac/office/2008/main" xmlns:mv="urn:schemas-microsoft-com:mac:vml" xmlns:o="urn:schemas-microsoft-com:office:office" xmlns:r="http://schemas.openxmlformats.org/officeDocument/2006/relationships" xmlns:v="urn:schemas-microsoft-com:vml" xmlns:w10="urn:schemas-microsoft-com:office:word" xmlns:w14="http://schemas.microsoft.com/office/word/2010/wordml" xmlns:w="http://schemas.openxmlformats.org/wordprocessingml/2006/main" xmlns:wne="http://schemas.microsoft.com/office/word/2006/wordml" xmlns:wp14="http://schemas.microsoft.com/office/word/2010/wordprocessingDrawing" xmlns:wp="http://schemas.openxmlformats.org/drawingml/2006/wordprocessingDrawing" xmlns:wpc="http://schemas.microsoft.com/office/word/2010/wordprocessingCanvas" xmlns:wpg="http://schemas.microsoft.com/office/word/2010/wordprocessingGroup" xmlns:wpi="http://schemas.microsoft.com/office/word/2010/wordprocessingInk" xmlns:wps="http://schemas.microsoft.com/office/word/2010/wordprocessingShape" mc:Ignorable="w14 wp14">
-  <w:p>
-    <w:pPr>
-      <w:pStyle w:val="Header"/>
-      <w:jc w:val="right"/>
-      <w:pBdr>
-        <w:bottom w:val="single" w:sz="5" w:color="D9E1E7"/>
-      </w:pBdr>
-    </w:pPr>
-    <w:r>
-      <w:rPr>
-        <w:b/>
-        <w:color w:val="2347C0"/>
-        <w:sz w:val="15"/>
-      </w:rPr>
-      <w:t>EFDS  /  MEMBER ACCESS</w:t>
-    </w:r>
-  </w:p>
-</w:hdr>
 </file>
 
 <file path=word/numbering.xml><?xml version="1.0" encoding="utf-8"?>
@@ -1157,12 +1032,12 @@
     <w:qFormat/>
     <w:rsid w:val="00FC693F"/>
     <w:pPr>
-      <w:spacing w:line="271" w:lineRule="auto"/>
+      <w:spacing w:after="140" w:line="278" w:lineRule="auto"/>
     </w:pPr>
     <w:rPr>
       <w:rFonts w:ascii="Aptos" w:hAnsi="Aptos"/>
-      <w:color w:val="15232B"/>
-      <w:sz w:val="18"/>
+      <w:color w:val="1B2B3B"/>
+      <w:sz w:val="20"/>
     </w:rPr>
   </w:style>
   <w:style w:type="paragraph" w:styleId="Header">
@@ -1244,15 +1119,15 @@
     <w:pPr>
       <w:keepNext/>
       <w:keepLines/>
-      <w:spacing w:before="200" w:after="0"/>
+      <w:spacing w:before="340" w:after="160"/>
       <w:outlineLvl w:val="1"/>
     </w:pPr>
     <w:rPr>
       <w:rFonts w:asciiTheme="majorHAnsi" w:eastAsiaTheme="majorEastAsia" w:hAnsiTheme="majorHAnsi" w:cstheme="majorBidi" w:ascii="Aptos Display" w:hAnsi="Aptos Display"/>
       <w:b/>
       <w:bCs/>
-      <w:color w:val="2347C0"/>
-      <w:sz w:val="25"/>
+      <w:color w:val="253EB5"/>
+      <w:sz w:val="26"/>
       <w:szCs w:val="26"/>
     </w:rPr>
   </w:style>
@@ -1509,15 +1384,16 @@
       <w:pBdr>
         <w:bottom w:val="single" w:sz="8" w:space="4" w:color="4F81BD" w:themeColor="accent1"/>
       </w:pBdr>
-      <w:spacing w:after="300" w:line="240" w:lineRule="auto"/>
+      <w:spacing w:after="200" w:line="240" w:lineRule="auto"/>
       <w:contextualSpacing/>
     </w:pPr>
     <w:rPr>
-      <w:rFonts w:asciiTheme="majorHAnsi" w:eastAsiaTheme="majorEastAsia" w:hAnsiTheme="majorHAnsi" w:cstheme="majorBidi"/>
-      <w:color w:val="17365D" w:themeColor="text2" w:themeShade="BF"/>
+      <w:rFonts w:asciiTheme="majorHAnsi" w:eastAsiaTheme="majorEastAsia" w:hAnsiTheme="majorHAnsi" w:cstheme="majorBidi" w:ascii="Aptos Display" w:hAnsi="Aptos Display"/>
+      <w:b/>
+      <w:color w:val="253EB5"/>
       <w:spacing w:val="5"/>
       <w:kern w:val="28"/>
-      <w:sz w:val="52"/>
+      <w:sz w:val="44"/>
       <w:szCs w:val="52"/>
     </w:rPr>
   </w:style>

</xml_diff>

<commit_message>
Merge committee and admin overview and simplify account review
</commit_message>
<xml_diff>
--- a/docs/EFDS_Committee_Account_Setup_Guide.docx
+++ b/docs/EFDS_Committee_Account_Setup_Guide.docx
@@ -68,11 +68,11 @@
             <w:color w:val="2540B5"/>
             <w:u w:val="single"/>
           </w:rPr>
-          <w:t>imperial-efds.com/login</w:t>
+          <w:t>imperial-efds.com/signup</w:t>
         </w:r>
       </w:hyperlink>
       <w:r>
-        <w:t xml:space="preserve">. Use your own verified </w:t>
+        <w:t xml:space="preserve">. Use your own </w:t>
       </w:r>
       <w:r>
         <w:rPr>
@@ -98,19 +98,19 @@
         <w:rPr>
           <w:b/>
         </w:rPr>
-        <w:t>First time? Set up password</w:t>
+        <w:t>Email me an account link</w:t>
       </w:r>
       <w:r>
-        <w:t xml:space="preserve"> and </w:t>
+        <w:t xml:space="preserve">, open the newest email, press </w:t>
       </w:r>
       <w:r>
         <w:rPr>
           <w:b/>
         </w:rPr>
-        <w:t>Send setup email</w:t>
+        <w:t>Continue</w:t>
       </w:r>
       <w:r>
-        <w:t>. You can also use an email sign-in link, or Google sign-in if its button is available. Microsoft sign-in is not offered.</w:t>
+        <w:t>, and set a password. Email ownership confirmation gives you basic member dashboard access immediately; society verification is a later, separate review. You can also use an email sign-in link, or Google sign-in if its button is available. Microsoft sign-in is not offered.</w:t>
       </w:r>
     </w:p>
     <w:p>
@@ -274,7 +274,7 @@
         </w:r>
       </w:hyperlink>
       <w:r>
-        <w:t xml:space="preserve"> after the person signs in once. Check the current society or committee record through a trusted source. A name, student email or self-description alone is not sufficient evidence. The panel records the acting admin, decision, reason and date. It prevents direct role changes, stale edits and two active accounts linking to the same officer entry.</w:t>
+        <w:t xml:space="preserve"> after the person signs in once. Check the current society or committee record through a trusted source. A name, student email or self-description alone is not sufficient evidence. The panel records the acting admin, decision and date. It prevents direct role changes, stale edits and two active accounts linking to the same officer entry.</w:t>
       </w:r>
     </w:p>
     <w:p>
@@ -306,13 +306,13 @@
         <w:t>Verify EFDS membership</w:t>
       </w:r>
       <w:r>
-        <w:t xml:space="preserve"> and record the source checked in </w:t>
+        <w:t xml:space="preserve"> and save</w:t>
       </w:r>
       <w:r>
         <w:rPr>
           <w:b/>
         </w:rPr>
-        <w:t>Reason</w:t>
+        <w:t/>
       </w:r>
       <w:r>
         <w:t xml:space="preserve">. If the claim cannot be confirmed, select </w:t>
@@ -324,7 +324,7 @@
         <w:t>Decline verification</w:t>
       </w:r>
       <w:r>
-        <w:t>, explain why and ask the person for corrected details. A declined account remains visible for follow-up.</w:t>
+        <w:t> and ask the person for corrected details. A declined account remains visible for follow-up.</w:t>
       </w:r>
     </w:p>
     <w:p>
@@ -356,7 +356,7 @@
         <w:t>Grant committee access</w:t>
       </w:r>
       <w:r>
-        <w:t>, state the reason and save. Verification and promotion are deliberately separate decisions.</w:t>
+        <w:t> and save. Verification and promotion are deliberately separate decisions.</w:t>
       </w:r>
     </w:p>
     <w:p>
@@ -405,7 +405,7 @@
         <w:t>Check the outcome.</w:t>
       </w:r>
       <w:r>
-        <w:t xml:space="preserve"> Ask the member to refresh their profile and ticket dashboard. Use the account panel's recent access decisions to confirm what changed and when. Admin promotion also requires a reason and cannot be applied to an unverified account. An admin cannot change their own role or remove the last active admin.</w:t>
+        <w:t xml:space="preserve"> Ask the member to refresh their profile and ticket dashboard. Use the account panel's recent access decisions to confirm what changed and when. Admin promotion cannot be applied to an unverified account. An admin cannot change their own role or remove the last active admin.</w:t>
       </w:r>
     </w:p>
     <w:p>

</xml_diff>

<commit_message>
Add email code verification, officer account linking, and sponsor identity
</commit_message>
<xml_diff>
--- a/docs/EFDS_Committee_Account_Setup_Guide.docx
+++ b/docs/EFDS_Committee_Account_Setup_Guide.docx
@@ -370,16 +370,16 @@
         <w:t>Link the correct officer entry.</w:t>
       </w:r>
       <w:r>
-        <w:t xml:space="preserve"> On the same account, select </w:t>
+        <w:t xml:space="preserve"> Open </w:t>
       </w:r>
       <w:r>
         <w:rPr>
           <w:b/>
         </w:rPr>
-        <w:t>Link committee identity</w:t>
+        <w:t/>
       </w:r>
       <w:r>
-        <w:t xml:space="preserve"> and choose the active officer roster entry with the correct full name, title and academic year. Check </w:t>
+        <w:t xml:space="preserve"/>
       </w:r>
       <w:hyperlink r:id="rId13">
         <w:r>
@@ -391,7 +391,7 @@
         </w:r>
       </w:hyperlink>
       <w:r>
-        <w:t xml:space="preserve"> if a roster entry is missing or already linked. The database refuses a duplicate active link.</w:t>
+        <w:t xml:space="preserve">. On the matching officer card, enter the member's exact account email and select Link account. The account must already have committee or admin access. To correct a mistaken link, select Remove account link before assigning another account. The database refuses duplicate active links.</w:t>
       </w:r>
     </w:p>
     <w:p>
@@ -405,7 +405,7 @@
         <w:t>Check the outcome.</w:t>
       </w:r>
       <w:r>
-        <w:t xml:space="preserve"> Ask the member to refresh their profile and ticket dashboard. Use the account panel's recent access decisions to confirm what changed and when. Admin promotion cannot be applied to an unverified account. An admin cannot change their own role or remove the last active admin.</w:t>
+        <w:t xml:space="preserve"> Ask the member to refresh their profile and ticket dashboard. Use the account panel's recent access decisions to confirm what changed and when, and check its account-email delivery status. Linking or removing a roster identity queues an email to the affected account. Admin promotion cannot be applied to an unverified account. An admin cannot change their own role or remove the last active admin.</w:t>
       </w:r>
     </w:p>
     <w:p>

</xml_diff>

<commit_message>
Support two linked accounts per committee role
</commit_message>
<xml_diff>
--- a/docs/EFDS_Committee_Account_Setup_Guide.docx
+++ b/docs/EFDS_Committee_Account_Setup_Guide.docx
@@ -1,653 +1,653 @@
 
 <file path=word/document.xml><?xml version="1.0" encoding="utf-8"?>
-<w:document xmlns:wpc="http://schemas.microsoft.com/office/word/2010/wordprocessingCanvas" xmlns:mo="http://schemas.microsoft.com/office/mac/office/2008/main" xmlns:mc="http://schemas.openxmlformats.org/markup-compatibility/2006" xmlns:mv="urn:schemas-microsoft-com:mac:vml" xmlns:o="urn:schemas-microsoft-com:office:office" xmlns:r="http://schemas.openxmlformats.org/officeDocument/2006/relationships" xmlns:m="http://schemas.openxmlformats.org/officeDocument/2006/math" xmlns:v="urn:schemas-microsoft-com:vml" xmlns:wp14="http://schemas.microsoft.com/office/word/2010/wordprocessingDrawing" xmlns:wp="http://schemas.openxmlformats.org/drawingml/2006/wordprocessingDrawing" xmlns:w10="urn:schemas-microsoft-com:office:word" xmlns:w="http://schemas.openxmlformats.org/wordprocessingml/2006/main" xmlns:w14="http://schemas.microsoft.com/office/word/2010/wordml" xmlns:wpg="http://schemas.microsoft.com/office/word/2010/wordprocessingGroup" xmlns:wpi="http://schemas.microsoft.com/office/word/2010/wordprocessingInk" xmlns:wne="http://schemas.microsoft.com/office/word/2006/wordml" xmlns:wps="http://schemas.microsoft.com/office/word/2010/wordprocessingShape" mc:Ignorable="w14 wp14">
-  <w:body>
-    <w:p>
-      <w:pPr>
-        <w:pStyle w:val="Title"/>
-      </w:pPr>
-      <w:r>
-        <w:t>Your EFDS committee account</w:t>
-      </w:r>
-    </w:p>
-    <w:p>
-      <w:r>
-        <w:rPr>
-          <w:b/>
-        </w:rPr>
-        <w:t>For EFDS committee members and account administrators · September 2026</w:t>
-      </w:r>
-    </w:p>
-    <w:p>
-      <w:r>
-        <w:t xml:space="preserve">Use your own account. Everyone starts as a </w:t>
-      </w:r>
-      <w:r>
-        <w:rPr>
-          <w:b/>
-        </w:rPr>
-        <w:t>member</w:t>
-      </w:r>
-      <w:r>
-        <w:t xml:space="preserve">, with full event access and public resources. An EFDS administrator can verify society membership, making you an </w:t>
-      </w:r>
-      <w:r>
-        <w:rPr>
-          <w:b/>
-        </w:rPr>
-        <w:t>EFDS member</w:t>
-      </w:r>
-      <w:r>
-        <w:t xml:space="preserve"> with access to member resources when they are published. Committee access and your officer roster identity are two further, separate steps.</w:t>
-      </w:r>
-    </w:p>
-    <w:p>
-      <w:pPr>
-        <w:pStyle w:val="Heading2"/>
-      </w:pPr>
-      <w:r>
-        <w:t>For committee members</w:t>
-      </w:r>
-    </w:p>
-    <w:p>
-      <w:pPr>
-        <w:pStyle w:val="ListNumber"/>
-      </w:pPr>
-      <w:r>
-        <w:rPr>
-          <w:b/>
-        </w:rPr>
-        <w:t>Create your account.</w:t>
-      </w:r>
-      <w:r>
-        <w:t xml:space="preserve"> Visit </w:t>
-      </w:r>
-      <w:hyperlink r:id="rId9">
-        <w:r>
-          <w:rPr>
-            <w:color w:val="2540B5"/>
-            <w:u w:val="single"/>
-          </w:rPr>
-          <w:t>imperial-efds.com/signup</w:t>
-        </w:r>
-      </w:hyperlink>
-      <w:r>
-        <w:t xml:space="preserve">. Use your own </w:t>
-      </w:r>
-      <w:r>
-        <w:rPr>
-          <w:rFonts w:ascii="Aptos Mono" w:hAnsi="Aptos Mono"/>
-          <w:sz w:val="18"/>
-        </w:rPr>
-        <w:t>@imperial.ac.uk</w:t>
-      </w:r>
-      <w:r>
-        <w:t xml:space="preserve"> or </w:t>
-      </w:r>
-      <w:r>
-        <w:rPr>
-          <w:rFonts w:ascii="Aptos Mono" w:hAnsi="Aptos Mono"/>
-          <w:sz w:val="18"/>
-        </w:rPr>
-        <w:t>@ic.ac.uk</w:t>
-      </w:r>
-      <w:r>
-        <w:t xml:space="preserve"> address. If you serve on the committee with a different address, ask an EFDS administrator to approve that address first. Select </w:t>
-      </w:r>
-      <w:r>
-        <w:rPr>
-          <w:b/>
-        </w:rPr>
-        <w:t>Email me an account link</w:t>
-      </w:r>
-      <w:r>
-        <w:t xml:space="preserve">, open the newest email, press </w:t>
-      </w:r>
-      <w:r>
-        <w:rPr>
-          <w:b/>
-        </w:rPr>
-        <w:t>Continue</w:t>
-      </w:r>
-      <w:r>
-        <w:t>, and set a password. Email ownership confirmation gives you basic member dashboard access immediately; society verification is a later, separate review. You can also use an email sign-in link, or Google sign-in if its button is available. Microsoft sign-in is not offered.</w:t>
-      </w:r>
-    </w:p>
-    <w:p>
-      <w:pPr>
-        <w:pStyle w:val="ListNumber"/>
-      </w:pPr>
-      <w:r>
-        <w:rPr>
-          <w:b/>
-        </w:rPr>
-        <w:t>Finish from your inbox.</w:t>
-      </w:r>
-      <w:r>
-        <w:t xml:space="preserve"> Open the newest EFDS email, then press </w:t>
-      </w:r>
-      <w:r>
-        <w:rPr>
-          <w:b/>
-        </w:rPr>
-        <w:t>Continue</w:t>
-      </w:r>
-      <w:r>
-        <w:t xml:space="preserve"> on the EFDS confirmation page. Set and confirm a password if prompted. Opening the link alone does not sign you in; the extra step protects against automatic email-security scans. If the link has expired, request a new one. Do not share it.</w:t>
-      </w:r>
-    </w:p>
-    <w:p>
-      <w:pPr>
-        <w:pStyle w:val="ListNumber"/>
-      </w:pPr>
-      <w:r>
-        <w:rPr>
-          <w:b/>
-        </w:rPr>
-        <w:t>Request society verification.</w:t>
-      </w:r>
-      <w:r>
-        <w:t xml:space="preserve"> Open </w:t>
-      </w:r>
-      <w:hyperlink r:id="rId10">
-        <w:r>
-          <w:rPr>
-            <w:color w:val="2540B5"/>
-            <w:u w:val="single"/>
-          </w:rPr>
-          <w:t>Your profile</w:t>
-        </w:r>
-      </w:hyperlink>
-      <w:r>
-        <w:t xml:space="preserve">. Under </w:t>
-      </w:r>
-      <w:r>
-        <w:rPr>
-          <w:b/>
-        </w:rPr>
-        <w:t>EFDS membership</w:t>
-      </w:r>
-      <w:r>
-        <w:t xml:space="preserve">, describe how you are connected to the society and select </w:t>
-      </w:r>
-      <w:r>
-        <w:rPr>
-          <w:b/>
-        </w:rPr>
-        <w:t>Send for review</w:t>
-      </w:r>
-      <w:r>
-        <w:t>. Your university email confirms affiliation with Imperial, but does not by itself prove society membership. Your member account still has full event access while the review is pending.</w:t>
-      </w:r>
-    </w:p>
-    <w:p>
-      <w:pPr>
-        <w:pStyle w:val="ListNumber"/>
-      </w:pPr>
-      <w:r>
-        <w:rPr>
-          <w:b/>
-        </w:rPr>
-        <w:t>Tell the administrator your committee identity.</w:t>
-      </w:r>
-      <w:r>
-        <w:t xml:space="preserve"> In your usual committee channel, share your full name, the exact account email, your official committee title and academic year. Never share a password, email sign-in link or reset code.</w:t>
-      </w:r>
-    </w:p>
-    <w:p>
-      <w:pPr>
-        <w:pStyle w:val="ListNumber"/>
-      </w:pPr>
-      <w:r>
-        <w:rPr>
-          <w:b/>
-        </w:rPr>
-        <w:t>Check your access.</w:t>
-      </w:r>
-      <w:r>
-        <w:t xml:space="preserve"> After an administrator confirms verification, committee access and your officer link, refresh </w:t>
-      </w:r>
-      <w:hyperlink r:id="rId10">
-        <w:r>
-          <w:rPr>
-            <w:color w:val="2540B5"/>
-            <w:u w:val="single"/>
-          </w:rPr>
-          <w:t>Your profile</w:t>
-        </w:r>
-      </w:hyperlink>
-      <w:r>
-        <w:t xml:space="preserve">. It should show </w:t>
-      </w:r>
-      <w:r>
-        <w:rPr>
-          <w:b/>
-        </w:rPr>
-        <w:t>Committee</w:t>
-      </w:r>
-      <w:r>
-        <w:t xml:space="preserve"> and the correct name, title and academic year. Open </w:t>
-      </w:r>
-      <w:hyperlink r:id="rId11">
-        <w:r>
-          <w:rPr>
-            <w:color w:val="2540B5"/>
-            <w:u w:val="single"/>
-          </w:rPr>
-          <w:t>Tickets</w:t>
-        </w:r>
-      </w:hyperlink>
-      <w:r>
-        <w:t xml:space="preserve"> to see committee work. Ask the administrator to correct any mismatch; do not create a second account.</w:t>
-      </w:r>
-    </w:p>
-    <w:p>
-      <w:r>
-        <w:rPr>
-          <w:b/>
-        </w:rPr>
-        <w:t>Keep one account.</w:t>
-      </w:r>
-      <w:r>
-        <w:t xml:space="preserve"> Signing in with a different email can create a separate identity. The account and officer roster entry are what connect you to ticket assignments.</w:t>
-      </w:r>
-    </w:p>
-    <w:p>
-      <w:pPr>
-        <w:pStyle w:val="Heading2"/>
-      </w:pPr>
-      <w:r>
-        <w:t>For EFDS account administrators</w:t>
-      </w:r>
-    </w:p>
-    <w:p>
-      <w:r>
-        <w:t xml:space="preserve">Use the </w:t>
-      </w:r>
-      <w:hyperlink r:id="rId12">
-        <w:r>
-          <w:rPr>
-            <w:color w:val="2540B5"/>
-            <w:u w:val="single"/>
-          </w:rPr>
-          <w:t>Accounts review panel</w:t>
-        </w:r>
-      </w:hyperlink>
-      <w:r>
-        <w:t xml:space="preserve"> after the person signs in once. Check the current society or committee record through a trusted source. A name, student email or self-description alone is not sufficient evidence. The panel records the acting admin, decision and date. It prevents direct role changes, stale edits and two active accounts linking to the same officer entry.</w:t>
-      </w:r>
-    </w:p>
-    <w:p>
-      <w:pPr>
-        <w:pStyle w:val="ListNumber"/>
-      </w:pPr>
-      <w:r>
-        <w:rPr>
-          <w:b/>
-        </w:rPr>
-        <w:t>Verify EFDS membership.</w:t>
-      </w:r>
-      <w:r>
-        <w:t xml:space="preserve"> In </w:t>
-      </w:r>
-      <w:r>
-        <w:rPr>
-          <w:b/>
-        </w:rPr>
-        <w:t>Needs review</w:t>
-      </w:r>
-      <w:r>
-        <w:t xml:space="preserve">, open the person's exact account. Compare their claim with an independent EFDS record. Select </w:t>
-      </w:r>
-      <w:r>
-        <w:rPr>
-          <w:b/>
-        </w:rPr>
-        <w:t>Verify EFDS membership</w:t>
-      </w:r>
-      <w:r>
-        <w:t xml:space="preserve"> and save</w:t>
-      </w:r>
-      <w:r>
-        <w:rPr>
-          <w:b/>
-        </w:rPr>
-        <w:t/>
-      </w:r>
-      <w:r>
-        <w:t xml:space="preserve">. If the claim cannot be confirmed, select </w:t>
-      </w:r>
-      <w:r>
-        <w:rPr>
-          <w:b/>
-        </w:rPr>
-        <w:t>Decline verification</w:t>
-      </w:r>
-      <w:r>
-        <w:t> and ask the person for corrected details. A declined account remains visible for follow-up.</w:t>
-      </w:r>
-    </w:p>
-    <w:p>
-      <w:pPr>
-        <w:pStyle w:val="ListNumber"/>
-      </w:pPr>
-      <w:r>
-        <w:rPr>
-          <w:b/>
-        </w:rPr>
-        <w:t>Grant committee access.</w:t>
-      </w:r>
-      <w:r>
-        <w:t xml:space="preserve"> After verification, switch to </w:t>
-      </w:r>
-      <w:r>
-        <w:rPr>
-          <w:b/>
-        </w:rPr>
-        <w:t>All active accounts</w:t>
-      </w:r>
-      <w:r>
-        <w:t xml:space="preserve">, find that account, select </w:t>
-      </w:r>
-      <w:r>
-        <w:rPr>
-          <w:b/>
-        </w:rPr>
-        <w:t>Grant committee access</w:t>
-      </w:r>
-      <w:r>
-        <w:t> and save. Verification and promotion are deliberately separate decisions.</w:t>
-      </w:r>
-    </w:p>
-    <w:p>
-      <w:pPr>
-        <w:pStyle w:val="ListNumber"/>
-      </w:pPr>
-      <w:r>
-        <w:rPr>
-          <w:b/>
-        </w:rPr>
-        <w:t>Link the correct officer entry.</w:t>
-      </w:r>
-      <w:r>
-        <w:t xml:space="preserve"> Open </w:t>
-      </w:r>
-      <w:r>
-        <w:rPr>
-          <w:b/>
-        </w:rPr>
-        <w:t/>
-      </w:r>
-      <w:r>
-        <w:t xml:space="preserve"/>
-      </w:r>
-      <w:hyperlink r:id="rId13">
-        <w:r>
-          <w:rPr>
-            <w:color w:val="2540B5"/>
-            <w:u w:val="single"/>
-          </w:rPr>
-          <w:t>Admin → Committee</w:t>
-        </w:r>
-      </w:hyperlink>
-      <w:r>
-        <w:t xml:space="preserve">. On the matching officer card, enter the member's exact account email and select Link account. The account must already have committee or admin access. To correct a mistaken link, select Remove account link before assigning another account. The database refuses duplicate active links.</w:t>
-      </w:r>
-    </w:p>
-    <w:p>
-      <w:pPr>
-        <w:pStyle w:val="ListNumber"/>
-      </w:pPr>
-      <w:r>
-        <w:rPr>
-          <w:b/>
-        </w:rPr>
-        <w:t>Check the outcome.</w:t>
-      </w:r>
-      <w:r>
-        <w:t xml:space="preserve"> Ask the member to refresh their profile and ticket dashboard. Use the account panel's recent access decisions to confirm what changed and when, and check its account-email delivery status. Linking or removing a roster identity queues an email to the affected account. Admin promotion cannot be applied to an unverified account. An admin cannot change their own role or remove the last active admin.</w:t>
-      </w:r>
-    </w:p>
-    <w:p>
-      <w:r>
-        <w:t xml:space="preserve">The old </w:t>
-      </w:r>
-      <w:r>
-        <w:rPr>
-          <w:rFonts w:ascii="Aptos Mono" w:hAnsi="Aptos Mono"/>
-          <w:sz w:val="18"/>
-        </w:rPr>
-        <w:t>grant_access.py</w:t>
-      </w:r>
-      <w:r>
-        <w:t xml:space="preserve"> database command remains a bootstrap or recovery tool for an authorised operator; routine account reviews now belong in the audited dashboard. Do not put database credentials in a command, shared document or chat.</w:t>
-      </w:r>
-    </w:p>
-    <w:p>
-      <w:pPr>
-        <w:pStyle w:val="Heading2"/>
-      </w:pPr>
-      <w:r>
-        <w:t>If something does not work</w:t>
-      </w:r>
-    </w:p>
-    <w:tbl>
-      <w:tblPr>
-        <w:tblStyle w:val="TableGrid"/>
-        <w:tblW w:type="auto" w:w="0"/>
-        <w:jc w:val="center"/>
-        <w:tblLook w:firstColumn="1" w:firstRow="1" w:lastColumn="0" w:lastRow="0" w:noHBand="0" w:noVBand="1" w:val="04A0"/>
-      </w:tblPr>
-      <w:tblGrid>
-        <w:gridCol w:w="4939"/>
-        <w:gridCol w:w="4939"/>
-      </w:tblGrid>
-      <w:tr>
-        <w:tc>
-          <w:tcPr>
-            <w:tcW w:type="dxa" w:w="4939"/>
-          </w:tcPr>
-          <w:p>
-            <w:r>
-              <w:rPr>
-                <w:b/>
-              </w:rPr>
-              <w:t>What you see</w:t>
-            </w:r>
-          </w:p>
-        </w:tc>
-        <w:tc>
-          <w:tcPr>
-            <w:tcW w:type="dxa" w:w="4939"/>
-          </w:tcPr>
-          <w:p>
-            <w:r>
-              <w:rPr>
-                <w:b/>
-              </w:rPr>
-              <w:t>What to do</w:t>
-            </w:r>
-          </w:p>
-        </w:tc>
-      </w:tr>
-      <w:tr>
-        <w:tc>
-          <w:tcPr>
-            <w:tcW w:type="dxa" w:w="4939"/>
-          </w:tcPr>
-          <w:p>
-            <w:r>
-              <w:t>No email arrives</w:t>
-            </w:r>
-          </w:p>
-        </w:tc>
-        <w:tc>
-          <w:tcPr>
-            <w:tcW w:type="dxa" w:w="4939"/>
-          </w:tcPr>
-          <w:p>
-            <w:r>
-              <w:t>Check junk mail, confirm the address, wait a few minutes, then request a new email. Ask an admin to inspect delivery health if it still fails.</w:t>
-            </w:r>
-          </w:p>
-        </w:tc>
-      </w:tr>
-      <w:tr>
-        <w:tc>
-          <w:tcPr>
-            <w:tcW w:type="dxa" w:w="4939"/>
-          </w:tcPr>
-          <w:p>
-            <w:r>
-              <w:t>The link opens the homepage or says expired</w:t>
-            </w:r>
-          </w:p>
-        </w:tc>
-        <w:tc>
-          <w:tcPr>
-            <w:tcW w:type="dxa" w:w="4939"/>
-          </w:tcPr>
-          <w:p>
-            <w:r>
-              <w:t>Request a fresh link and open the newest one. Send an admin the error text, never the link or its code.</w:t>
-            </w:r>
-          </w:p>
-        </w:tc>
-      </w:tr>
-      <w:tr>
-        <w:tc>
-          <w:tcPr>
-            <w:tcW w:type="dxa" w:w="4939"/>
-          </w:tcPr>
-          <w:p>
-            <w:r>
-              <w:t>You can sign in, but only see member access</w:t>
-            </w:r>
-          </w:p>
-        </w:tc>
-        <w:tc>
-          <w:tcPr>
-            <w:tcW w:type="dxa" w:w="4939"/>
-          </w:tcPr>
-          <w:p>
-            <w:r>
-              <w:t>Complete the EFDS membership request on your profile; ask an admin to review the exact account email.</w:t>
-            </w:r>
-          </w:p>
-        </w:tc>
-      </w:tr>
-      <w:tr>
-        <w:tc>
-          <w:tcPr>
-            <w:tcW w:type="dxa" w:w="4939"/>
-          </w:tcPr>
-          <w:p>
-            <w:r>
-              <w:t>EFDS member access is active, but Tickets is missing</w:t>
-            </w:r>
-          </w:p>
-        </w:tc>
-        <w:tc>
-          <w:tcPr>
-            <w:tcW w:type="dxa" w:w="4939"/>
-          </w:tcPr>
-          <w:p>
-            <w:r>
-              <w:t>Ask an admin to grant committee access and link your roster identity.</w:t>
-            </w:r>
-          </w:p>
-        </w:tc>
-      </w:tr>
-      <w:tr>
-        <w:tc>
-          <w:tcPr>
-            <w:tcW w:type="dxa" w:w="4939"/>
-          </w:tcPr>
-          <w:p>
-            <w:r>
-              <w:t>Committee access appears, but your title is wrong</w:t>
-            </w:r>
-          </w:p>
-        </w:tc>
-        <w:tc>
-          <w:tcPr>
-            <w:tcW w:type="dxa" w:w="4939"/>
-          </w:tcPr>
-          <w:p>
-            <w:r>
-              <w:t>Ask an admin to correct the officer link. Do not make another account.</w:t>
-            </w:r>
-          </w:p>
-        </w:tc>
-      </w:tr>
-      <w:tr>
-        <w:tc>
-          <w:tcPr>
-            <w:tcW w:type="dxa" w:w="4939"/>
-          </w:tcPr>
-          <w:p>
-            <w:r>
-              <w:t>Password sign-in fails</w:t>
-            </w:r>
-          </w:p>
-        </w:tc>
-        <w:tc>
-          <w:tcPr>
-            <w:tcW w:type="dxa" w:w="4939"/>
-          </w:tcPr>
-          <w:p>
-            <w:r>
-              <w:t xml:space="preserve">Use </w:t>
-            </w:r>
-            <w:r>
-              <w:rPr>
-                <w:b/>
-              </w:rPr>
-              <w:t>Forgot password?</w:t>
-            </w:r>
-            <w:r>
-              <w:t xml:space="preserve"> or an email sign-in link.</w:t>
-            </w:r>
-          </w:p>
-        </w:tc>
-      </w:tr>
-      <w:tr>
-        <w:tc>
-          <w:tcPr>
-            <w:tcW w:type="dxa" w:w="4939"/>
-          </w:tcPr>
-          <w:p>
-            <w:r>
-              <w:t>Google sign-in is unavailable</w:t>
-            </w:r>
-          </w:p>
-        </w:tc>
-        <w:tc>
-          <w:tcPr>
-            <w:tcW w:type="dxa" w:w="4939"/>
-          </w:tcPr>
-          <w:p>
-            <w:r>
-              <w:t>Use email sign-in. Google requires separate provider configuration.</w:t>
-            </w:r>
-          </w:p>
-        </w:tc>
-      </w:tr>
-    </w:tbl>
-    <w:p>
-      <w:r>
-        <w:t>EFDS is a student society. Its account access is managed by the society and is separate from Imperial College London's account permissions.</w:t>
-      </w:r>
-    </w:p>
-    <w:sectPr>
-      <w:footerReference w:type="default" r:id="rId14"/>
-      <w:pgSz w:w="12240" w:h="15840"/>
-      <w:pgMar w:top="1080" w:right="1181" w:bottom="1008" w:left="1181" w:header="720" w:footer="720" w:gutter="0"/>
-      <w:cols w:space="720"/>
-      <w:docGrid w:linePitch="360"/>
-    </w:sectPr>
-  </w:body>
-</w:document>
+<ns0:document xmlns:ns0="http://schemas.openxmlformats.org/wordprocessingml/2006/main" xmlns:ns1="http://schemas.openxmlformats.org/markup-compatibility/2006" xmlns:ns2="http://schemas.openxmlformats.org/officeDocument/2006/relationships" ns1:Ignorable="w14 wp14">
+  <ns0:body>
+    <ns0:p>
+      <ns0:pPr>
+        <ns0:pStyle ns0:val="Title"/>
+      </ns0:pPr>
+      <ns0:r>
+        <ns0:t>Your EFDS committee account</ns0:t>
+      </ns0:r>
+    </ns0:p>
+    <ns0:p>
+      <ns0:r>
+        <ns0:rPr>
+          <ns0:b/>
+        </ns0:rPr>
+        <ns0:t>For EFDS committee members and account administrators · September 2026</ns0:t>
+      </ns0:r>
+    </ns0:p>
+    <ns0:p>
+      <ns0:r>
+        <ns0:t xml:space="preserve">Use your own account. Everyone starts as a </ns0:t>
+      </ns0:r>
+      <ns0:r>
+        <ns0:rPr>
+          <ns0:b/>
+        </ns0:rPr>
+        <ns0:t>member</ns0:t>
+      </ns0:r>
+      <ns0:r>
+        <ns0:t xml:space="preserve">, with full event access and public resources. An EFDS administrator can verify society membership, making you an </ns0:t>
+      </ns0:r>
+      <ns0:r>
+        <ns0:rPr>
+          <ns0:b/>
+        </ns0:rPr>
+        <ns0:t>EFDS member</ns0:t>
+      </ns0:r>
+      <ns0:r>
+        <ns0:t xml:space="preserve"> with access to member resources when they are published. Committee access and your officer roster identity are two further, separate steps.</ns0:t>
+      </ns0:r>
+    </ns0:p>
+    <ns0:p>
+      <ns0:pPr>
+        <ns0:pStyle ns0:val="Heading2"/>
+      </ns0:pPr>
+      <ns0:r>
+        <ns0:t>For committee members</ns0:t>
+      </ns0:r>
+    </ns0:p>
+    <ns0:p>
+      <ns0:pPr>
+        <ns0:pStyle ns0:val="ListNumber"/>
+      </ns0:pPr>
+      <ns0:r>
+        <ns0:rPr>
+          <ns0:b/>
+        </ns0:rPr>
+        <ns0:t>Create your account.</ns0:t>
+      </ns0:r>
+      <ns0:r>
+        <ns0:t xml:space="preserve"> Visit </ns0:t>
+      </ns0:r>
+      <ns0:hyperlink ns2:id="rId9">
+        <ns0:r>
+          <ns0:rPr>
+            <ns0:color ns0:val="2540B5"/>
+            <ns0:u ns0:val="single"/>
+          </ns0:rPr>
+          <ns0:t>imperial-efds.com/signup</ns0:t>
+        </ns0:r>
+      </ns0:hyperlink>
+      <ns0:r>
+        <ns0:t xml:space="preserve">. Use your own </ns0:t>
+      </ns0:r>
+      <ns0:r>
+        <ns0:rPr>
+          <ns0:rFonts ns0:ascii="Aptos Mono" ns0:hAnsi="Aptos Mono"/>
+          <ns0:sz ns0:val="18"/>
+        </ns0:rPr>
+        <ns0:t>@imperial.ac.uk</ns0:t>
+      </ns0:r>
+      <ns0:r>
+        <ns0:t xml:space="preserve"> or </ns0:t>
+      </ns0:r>
+      <ns0:r>
+        <ns0:rPr>
+          <ns0:rFonts ns0:ascii="Aptos Mono" ns0:hAnsi="Aptos Mono"/>
+          <ns0:sz ns0:val="18"/>
+        </ns0:rPr>
+        <ns0:t>@ic.ac.uk</ns0:t>
+      </ns0:r>
+      <ns0:r>
+        <ns0:t xml:space="preserve"> address. If you serve on the committee with a different address, ask an EFDS administrator to approve that address first. Select </ns0:t>
+      </ns0:r>
+      <ns0:r>
+        <ns0:rPr>
+          <ns0:b/>
+        </ns0:rPr>
+        <ns0:t>Email me an account link</ns0:t>
+      </ns0:r>
+      <ns0:r>
+        <ns0:t xml:space="preserve">, open the newest email, press </ns0:t>
+      </ns0:r>
+      <ns0:r>
+        <ns0:rPr>
+          <ns0:b/>
+        </ns0:rPr>
+        <ns0:t>Continue</ns0:t>
+      </ns0:r>
+      <ns0:r>
+        <ns0:t>, and set a password. Email ownership confirmation gives you basic member dashboard access immediately; society verification is a later, separate review. You can also use an email sign-in link, or Google sign-in if its button is available. Microsoft sign-in is not offered.</ns0:t>
+      </ns0:r>
+    </ns0:p>
+    <ns0:p>
+      <ns0:pPr>
+        <ns0:pStyle ns0:val="ListNumber"/>
+      </ns0:pPr>
+      <ns0:r>
+        <ns0:rPr>
+          <ns0:b/>
+        </ns0:rPr>
+        <ns0:t>Finish from your inbox.</ns0:t>
+      </ns0:r>
+      <ns0:r>
+        <ns0:t xml:space="preserve"> Open the newest EFDS email, then press </ns0:t>
+      </ns0:r>
+      <ns0:r>
+        <ns0:rPr>
+          <ns0:b/>
+        </ns0:rPr>
+        <ns0:t>Continue</ns0:t>
+      </ns0:r>
+      <ns0:r>
+        <ns0:t xml:space="preserve"> on the EFDS confirmation page. Set and confirm a password if prompted. Opening the link alone does not sign you in; the extra step protects against automatic email-security scans. If the link has expired, request a new one. Do not share it.</ns0:t>
+      </ns0:r>
+    </ns0:p>
+    <ns0:p>
+      <ns0:pPr>
+        <ns0:pStyle ns0:val="ListNumber"/>
+      </ns0:pPr>
+      <ns0:r>
+        <ns0:rPr>
+          <ns0:b/>
+        </ns0:rPr>
+        <ns0:t>Request society verification.</ns0:t>
+      </ns0:r>
+      <ns0:r>
+        <ns0:t xml:space="preserve"> Open </ns0:t>
+      </ns0:r>
+      <ns0:hyperlink ns2:id="rId10">
+        <ns0:r>
+          <ns0:rPr>
+            <ns0:color ns0:val="2540B5"/>
+            <ns0:u ns0:val="single"/>
+          </ns0:rPr>
+          <ns0:t>Your profile</ns0:t>
+        </ns0:r>
+      </ns0:hyperlink>
+      <ns0:r>
+        <ns0:t xml:space="preserve">. Under </ns0:t>
+      </ns0:r>
+      <ns0:r>
+        <ns0:rPr>
+          <ns0:b/>
+        </ns0:rPr>
+        <ns0:t>EFDS membership</ns0:t>
+      </ns0:r>
+      <ns0:r>
+        <ns0:t xml:space="preserve">, describe how you are connected to the society and select </ns0:t>
+      </ns0:r>
+      <ns0:r>
+        <ns0:rPr>
+          <ns0:b/>
+        </ns0:rPr>
+        <ns0:t>Send for review</ns0:t>
+      </ns0:r>
+      <ns0:r>
+        <ns0:t>. Your university email confirms affiliation with Imperial, but does not by itself prove society membership. Your member account still has full event access while the review is pending.</ns0:t>
+      </ns0:r>
+    </ns0:p>
+    <ns0:p>
+      <ns0:pPr>
+        <ns0:pStyle ns0:val="ListNumber"/>
+      </ns0:pPr>
+      <ns0:r>
+        <ns0:rPr>
+          <ns0:b/>
+        </ns0:rPr>
+        <ns0:t>Tell the administrator your committee identity.</ns0:t>
+      </ns0:r>
+      <ns0:r>
+        <ns0:t xml:space="preserve"> In your usual committee channel, share your full name, the exact account email, your official committee title and academic year. Never share a password, email sign-in link or reset code.</ns0:t>
+      </ns0:r>
+    </ns0:p>
+    <ns0:p>
+      <ns0:pPr>
+        <ns0:pStyle ns0:val="ListNumber"/>
+      </ns0:pPr>
+      <ns0:r>
+        <ns0:rPr>
+          <ns0:b/>
+        </ns0:rPr>
+        <ns0:t>Check your access.</ns0:t>
+      </ns0:r>
+      <ns0:r>
+        <ns0:t xml:space="preserve"> After an administrator confirms verification, committee access and your officer link, refresh </ns0:t>
+      </ns0:r>
+      <ns0:hyperlink ns2:id="rId10">
+        <ns0:r>
+          <ns0:rPr>
+            <ns0:color ns0:val="2540B5"/>
+            <ns0:u ns0:val="single"/>
+          </ns0:rPr>
+          <ns0:t>Your profile</ns0:t>
+        </ns0:r>
+      </ns0:hyperlink>
+      <ns0:r>
+        <ns0:t xml:space="preserve">. It should show </ns0:t>
+      </ns0:r>
+      <ns0:r>
+        <ns0:rPr>
+          <ns0:b/>
+        </ns0:rPr>
+        <ns0:t>Committee</ns0:t>
+      </ns0:r>
+      <ns0:r>
+        <ns0:t xml:space="preserve"> and the correct name, title and academic year. Open </ns0:t>
+      </ns0:r>
+      <ns0:hyperlink ns2:id="rId11">
+        <ns0:r>
+          <ns0:rPr>
+            <ns0:color ns0:val="2540B5"/>
+            <ns0:u ns0:val="single"/>
+          </ns0:rPr>
+          <ns0:t>Tickets</ns0:t>
+        </ns0:r>
+      </ns0:hyperlink>
+      <ns0:r>
+        <ns0:t xml:space="preserve"> to see committee work. Ask the administrator to correct any mismatch; do not create a second account.</ns0:t>
+      </ns0:r>
+    </ns0:p>
+    <ns0:p>
+      <ns0:r>
+        <ns0:rPr>
+          <ns0:b/>
+        </ns0:rPr>
+        <ns0:t>Keep one account.</ns0:t>
+      </ns0:r>
+      <ns0:r>
+        <ns0:t xml:space="preserve"> Signing in with a different email can create a separate identity. The account and officer roster entry are what connect you to ticket assignments.</ns0:t>
+      </ns0:r>
+    </ns0:p>
+    <ns0:p>
+      <ns0:pPr>
+        <ns0:pStyle ns0:val="Heading2"/>
+      </ns0:pPr>
+      <ns0:r>
+        <ns0:t>For EFDS account administrators</ns0:t>
+      </ns0:r>
+    </ns0:p>
+    <ns0:p>
+      <ns0:r>
+        <ns0:t xml:space="preserve">Use the </ns0:t>
+      </ns0:r>
+      <ns0:hyperlink ns2:id="rId12">
+        <ns0:r>
+          <ns0:rPr>
+            <ns0:color ns0:val="2540B5"/>
+            <ns0:u ns0:val="single"/>
+          </ns0:rPr>
+          <ns0:t>Accounts review panel</ns0:t>
+        </ns0:r>
+      </ns0:hyperlink>
+      <ns0:r>
+        <ns0:t xml:space="preserve"> after the person signs in once. Check the current society or committee record through a trusted source. A name, student email or self-description alone is not sufficient evidence. The panel records the acting admin, decision and date. It prevents direct role changes, stale edits and more than two active accounts linking to the same officer entry.</ns0:t>
+      </ns0:r>
+    </ns0:p>
+    <ns0:p>
+      <ns0:pPr>
+        <ns0:pStyle ns0:val="ListNumber"/>
+      </ns0:pPr>
+      <ns0:r>
+        <ns0:rPr>
+          <ns0:b/>
+        </ns0:rPr>
+        <ns0:t>Verify EFDS membership.</ns0:t>
+      </ns0:r>
+      <ns0:r>
+        <ns0:t xml:space="preserve"> In </ns0:t>
+      </ns0:r>
+      <ns0:r>
+        <ns0:rPr>
+          <ns0:b/>
+        </ns0:rPr>
+        <ns0:t>Needs review</ns0:t>
+      </ns0:r>
+      <ns0:r>
+        <ns0:t xml:space="preserve">, open the person's exact account. Compare their claim with an independent EFDS record. Select </ns0:t>
+      </ns0:r>
+      <ns0:r>
+        <ns0:rPr>
+          <ns0:b/>
+        </ns0:rPr>
+        <ns0:t>Verify EFDS membership</ns0:t>
+      </ns0:r>
+      <ns0:r>
+        <ns0:t xml:space="preserve"> and save</ns0:t>
+      </ns0:r>
+      <ns0:r>
+        <ns0:rPr>
+          <ns0:b/>
+        </ns0:rPr>
+        <ns0:t/>
+      </ns0:r>
+      <ns0:r>
+        <ns0:t xml:space="preserve">. If the claim cannot be confirmed, select </ns0:t>
+      </ns0:r>
+      <ns0:r>
+        <ns0:rPr>
+          <ns0:b/>
+        </ns0:rPr>
+        <ns0:t>Decline verification</ns0:t>
+      </ns0:r>
+      <ns0:r>
+        <ns0:t> and ask the person for corrected details. A declined account remains visible for follow-up.</ns0:t>
+      </ns0:r>
+    </ns0:p>
+    <ns0:p>
+      <ns0:pPr>
+        <ns0:pStyle ns0:val="ListNumber"/>
+      </ns0:pPr>
+      <ns0:r>
+        <ns0:rPr>
+          <ns0:b/>
+        </ns0:rPr>
+        <ns0:t>Grant committee access.</ns0:t>
+      </ns0:r>
+      <ns0:r>
+        <ns0:t xml:space="preserve"> After verification, switch to </ns0:t>
+      </ns0:r>
+      <ns0:r>
+        <ns0:rPr>
+          <ns0:b/>
+        </ns0:rPr>
+        <ns0:t>All active accounts</ns0:t>
+      </ns0:r>
+      <ns0:r>
+        <ns0:t xml:space="preserve">, find that account, select </ns0:t>
+      </ns0:r>
+      <ns0:r>
+        <ns0:rPr>
+          <ns0:b/>
+        </ns0:rPr>
+        <ns0:t>Grant committee access</ns0:t>
+      </ns0:r>
+      <ns0:r>
+        <ns0:t> and save. Verification and promotion are deliberately separate decisions.</ns0:t>
+      </ns0:r>
+    </ns0:p>
+    <ns0:p>
+      <ns0:pPr>
+        <ns0:pStyle ns0:val="ListNumber"/>
+      </ns0:pPr>
+      <ns0:r>
+        <ns0:rPr>
+          <ns0:b/>
+        </ns0:rPr>
+        <ns0:t>Link the correct officer entry.</ns0:t>
+      </ns0:r>
+      <ns0:r>
+        <ns0:t xml:space="preserve"> Open </ns0:t>
+      </ns0:r>
+      <ns0:r>
+        <ns0:rPr>
+          <ns0:b/>
+        </ns0:rPr>
+        <ns0:t/>
+      </ns0:r>
+      <ns0:r>
+        <ns0:t xml:space="preserve"/>
+      </ns0:r>
+      <ns0:hyperlink ns2:id="rId13">
+        <ns0:r>
+          <ns0:rPr>
+            <ns0:color ns0:val="2540B5"/>
+            <ns0:u ns0:val="single"/>
+          </ns0:rPr>
+          <ns0:t>Admin → Committee</ns0:t>
+        </ns0:r>
+      </ns0:hyperlink>
+      <ns0:r>
+        <ns0:t xml:space="preserve">. On the matching officer card, enter the member's exact account email and select Link account. Each officer role accepts up to two accounts; each account can link to only one role. The account must already have committee or admin access. To correct a mistaken link, select Remove link beside that account before assigning another.</ns0:t>
+      </ns0:r>
+    </ns0:p>
+    <ns0:p>
+      <ns0:pPr>
+        <ns0:pStyle ns0:val="ListNumber"/>
+      </ns0:pPr>
+      <ns0:r>
+        <ns0:rPr>
+          <ns0:b/>
+        </ns0:rPr>
+        <ns0:t>Check the outcome.</ns0:t>
+      </ns0:r>
+      <ns0:r>
+        <ns0:t xml:space="preserve"> Ask the member to refresh their profile and ticket dashboard. Use the account panel's recent access decisions to confirm what changed and when, and check its account-email delivery status. Linking or removing a roster identity queues an email to the affected account. Admin promotion cannot be applied to an unverified account. An admin cannot change their own role or remove the last active admin.</ns0:t>
+      </ns0:r>
+    </ns0:p>
+    <ns0:p>
+      <ns0:r>
+        <ns0:t xml:space="preserve">The old </ns0:t>
+      </ns0:r>
+      <ns0:r>
+        <ns0:rPr>
+          <ns0:rFonts ns0:ascii="Aptos Mono" ns0:hAnsi="Aptos Mono"/>
+          <ns0:sz ns0:val="18"/>
+        </ns0:rPr>
+        <ns0:t>grant_access.py</ns0:t>
+      </ns0:r>
+      <ns0:r>
+        <ns0:t xml:space="preserve"> database command remains a bootstrap or recovery tool for an authorised operator; routine account reviews now belong in the audited dashboard. Do not put database credentials in a command, shared document or chat.</ns0:t>
+      </ns0:r>
+    </ns0:p>
+    <ns0:p>
+      <ns0:pPr>
+        <ns0:pStyle ns0:val="Heading2"/>
+      </ns0:pPr>
+      <ns0:r>
+        <ns0:t>If something does not work</ns0:t>
+      </ns0:r>
+    </ns0:p>
+    <ns0:tbl>
+      <ns0:tblPr>
+        <ns0:tblStyle ns0:val="TableGrid"/>
+        <ns0:tblW ns0:type="auto" ns0:w="0"/>
+        <ns0:jc ns0:val="center"/>
+        <ns0:tblLook ns0:firstColumn="1" ns0:firstRow="1" ns0:lastColumn="0" ns0:lastRow="0" ns0:noHBand="0" ns0:noVBand="1" ns0:val="04A0"/>
+      </ns0:tblPr>
+      <ns0:tblGrid>
+        <ns0:gridCol ns0:w="4939"/>
+        <ns0:gridCol ns0:w="4939"/>
+      </ns0:tblGrid>
+      <ns0:tr>
+        <ns0:tc>
+          <ns0:tcPr>
+            <ns0:tcW ns0:type="dxa" ns0:w="4939"/>
+          </ns0:tcPr>
+          <ns0:p>
+            <ns0:r>
+              <ns0:rPr>
+                <ns0:b/>
+              </ns0:rPr>
+              <ns0:t>What you see</ns0:t>
+            </ns0:r>
+          </ns0:p>
+        </ns0:tc>
+        <ns0:tc>
+          <ns0:tcPr>
+            <ns0:tcW ns0:type="dxa" ns0:w="4939"/>
+          </ns0:tcPr>
+          <ns0:p>
+            <ns0:r>
+              <ns0:rPr>
+                <ns0:b/>
+              </ns0:rPr>
+              <ns0:t>What to do</ns0:t>
+            </ns0:r>
+          </ns0:p>
+        </ns0:tc>
+      </ns0:tr>
+      <ns0:tr>
+        <ns0:tc>
+          <ns0:tcPr>
+            <ns0:tcW ns0:type="dxa" ns0:w="4939"/>
+          </ns0:tcPr>
+          <ns0:p>
+            <ns0:r>
+              <ns0:t>No email arrives</ns0:t>
+            </ns0:r>
+          </ns0:p>
+        </ns0:tc>
+        <ns0:tc>
+          <ns0:tcPr>
+            <ns0:tcW ns0:type="dxa" ns0:w="4939"/>
+          </ns0:tcPr>
+          <ns0:p>
+            <ns0:r>
+              <ns0:t>Check junk mail, confirm the address, wait a few minutes, then request a new email. Ask an admin to inspect delivery health if it still fails.</ns0:t>
+            </ns0:r>
+          </ns0:p>
+        </ns0:tc>
+      </ns0:tr>
+      <ns0:tr>
+        <ns0:tc>
+          <ns0:tcPr>
+            <ns0:tcW ns0:type="dxa" ns0:w="4939"/>
+          </ns0:tcPr>
+          <ns0:p>
+            <ns0:r>
+              <ns0:t>The link opens the homepage or says expired</ns0:t>
+            </ns0:r>
+          </ns0:p>
+        </ns0:tc>
+        <ns0:tc>
+          <ns0:tcPr>
+            <ns0:tcW ns0:type="dxa" ns0:w="4939"/>
+          </ns0:tcPr>
+          <ns0:p>
+            <ns0:r>
+              <ns0:t>Request a fresh link and open the newest one. Send an admin the error text, never the link or its code.</ns0:t>
+            </ns0:r>
+          </ns0:p>
+        </ns0:tc>
+      </ns0:tr>
+      <ns0:tr>
+        <ns0:tc>
+          <ns0:tcPr>
+            <ns0:tcW ns0:type="dxa" ns0:w="4939"/>
+          </ns0:tcPr>
+          <ns0:p>
+            <ns0:r>
+              <ns0:t>You can sign in, but only see member access</ns0:t>
+            </ns0:r>
+          </ns0:p>
+        </ns0:tc>
+        <ns0:tc>
+          <ns0:tcPr>
+            <ns0:tcW ns0:type="dxa" ns0:w="4939"/>
+          </ns0:tcPr>
+          <ns0:p>
+            <ns0:r>
+              <ns0:t>Complete the EFDS membership request on your profile; ask an admin to review the exact account email.</ns0:t>
+            </ns0:r>
+          </ns0:p>
+        </ns0:tc>
+      </ns0:tr>
+      <ns0:tr>
+        <ns0:tc>
+          <ns0:tcPr>
+            <ns0:tcW ns0:type="dxa" ns0:w="4939"/>
+          </ns0:tcPr>
+          <ns0:p>
+            <ns0:r>
+              <ns0:t>EFDS member access is active, but Tickets is missing</ns0:t>
+            </ns0:r>
+          </ns0:p>
+        </ns0:tc>
+        <ns0:tc>
+          <ns0:tcPr>
+            <ns0:tcW ns0:type="dxa" ns0:w="4939"/>
+          </ns0:tcPr>
+          <ns0:p>
+            <ns0:r>
+              <ns0:t>Ask an admin to grant committee access and link your roster identity.</ns0:t>
+            </ns0:r>
+          </ns0:p>
+        </ns0:tc>
+      </ns0:tr>
+      <ns0:tr>
+        <ns0:tc>
+          <ns0:tcPr>
+            <ns0:tcW ns0:type="dxa" ns0:w="4939"/>
+          </ns0:tcPr>
+          <ns0:p>
+            <ns0:r>
+              <ns0:t>Committee access appears, but your title is wrong</ns0:t>
+            </ns0:r>
+          </ns0:p>
+        </ns0:tc>
+        <ns0:tc>
+          <ns0:tcPr>
+            <ns0:tcW ns0:type="dxa" ns0:w="4939"/>
+          </ns0:tcPr>
+          <ns0:p>
+            <ns0:r>
+              <ns0:t>Ask an admin to correct the officer link. Do not make another account.</ns0:t>
+            </ns0:r>
+          </ns0:p>
+        </ns0:tc>
+      </ns0:tr>
+      <ns0:tr>
+        <ns0:tc>
+          <ns0:tcPr>
+            <ns0:tcW ns0:type="dxa" ns0:w="4939"/>
+          </ns0:tcPr>
+          <ns0:p>
+            <ns0:r>
+              <ns0:t>Password sign-in fails</ns0:t>
+            </ns0:r>
+          </ns0:p>
+        </ns0:tc>
+        <ns0:tc>
+          <ns0:tcPr>
+            <ns0:tcW ns0:type="dxa" ns0:w="4939"/>
+          </ns0:tcPr>
+          <ns0:p>
+            <ns0:r>
+              <ns0:t xml:space="preserve">Use </ns0:t>
+            </ns0:r>
+            <ns0:r>
+              <ns0:rPr>
+                <ns0:b/>
+              </ns0:rPr>
+              <ns0:t>Forgot password?</ns0:t>
+            </ns0:r>
+            <ns0:r>
+              <ns0:t xml:space="preserve"> or an email sign-in link.</ns0:t>
+            </ns0:r>
+          </ns0:p>
+        </ns0:tc>
+      </ns0:tr>
+      <ns0:tr>
+        <ns0:tc>
+          <ns0:tcPr>
+            <ns0:tcW ns0:type="dxa" ns0:w="4939"/>
+          </ns0:tcPr>
+          <ns0:p>
+            <ns0:r>
+              <ns0:t>Google sign-in is unavailable</ns0:t>
+            </ns0:r>
+          </ns0:p>
+        </ns0:tc>
+        <ns0:tc>
+          <ns0:tcPr>
+            <ns0:tcW ns0:type="dxa" ns0:w="4939"/>
+          </ns0:tcPr>
+          <ns0:p>
+            <ns0:r>
+              <ns0:t>Use email sign-in. Google requires separate provider configuration.</ns0:t>
+            </ns0:r>
+          </ns0:p>
+        </ns0:tc>
+      </ns0:tr>
+    </ns0:tbl>
+    <ns0:p>
+      <ns0:r>
+        <ns0:t>EFDS is a student society. Its account access is managed by the society and is separate from Imperial College London's account permissions.</ns0:t>
+      </ns0:r>
+    </ns0:p>
+    <ns0:sectPr ns0:rsidR="00FC693F" ns0:rsidRPr="0006063C" ns0:rsidSect="00034616">
+      <ns0:footerReference ns0:type="default" ns2:id="rId14"/>
+      <ns0:pgSz ns0:w="12240" ns0:h="15840"/>
+      <ns0:pgMar ns0:top="1080" ns0:right="1181" ns0:bottom="1008" ns0:left="1181" ns0:header="720" ns0:footer="720" ns0:gutter="0"/>
+      <ns0:cols ns0:space="720"/>
+      <ns0:docGrid ns0:linePitch="360"/>
+    </ns0:sectPr>
+  </ns0:body>
+</ns0:document>
 </file>
 
 <file path=word/footer1.xml><?xml version="1.0" encoding="utf-8"?>

</xml_diff>

<commit_message>
Clarify EFDS student access and add daily career examples
</commit_message>
<xml_diff>
--- a/docs/EFDS_Committee_Account_Setup_Guide.docx
+++ b/docs/EFDS_Committee_Account_Setup_Guide.docx
@@ -20,25 +20,25 @@
     </ns0:p>
     <ns0:p>
       <ns0:r>
-        <ns0:t xml:space="preserve">Use your own account. Everyone starts as a </ns0:t>
+        <ns0:t xml:space="preserve">Use your own account. Eligible new accounts start as </ns0:t>
       </ns0:r>
       <ns0:r>
         <ns0:rPr>
           <ns0:b/>
         </ns0:rPr>
-        <ns0:t>member</ns0:t>
+        <ns0:t>EFDS members</ns0:t>
       </ns0:r>
       <ns0:r>
-        <ns0:t xml:space="preserve">, with full event access and public resources. An EFDS administrator can verify society membership, making you an </ns0:t>
+        <ns0:t xml:space="preserve">, with full event access and public resources. An EFDS administrator can verify enrolment on Imperial’s BSc Economics, Finance and Data Science, granting </ns0:t>
       </ns0:r>
       <ns0:r>
         <ns0:rPr>
           <ns0:b/>
         </ns0:rPr>
-        <ns0:t>EFDS member</ns0:t>
+        <ns0:t>EFDS student</ns0:t>
       </ns0:r>
       <ns0:r>
-        <ns0:t xml:space="preserve"> with access to member resources when they are published. Committee access and your officer roster identity are two further, separate steps.</ns0:t>
+        <ns0:t xml:space="preserve"> access to student resources. EFDS Union society membership alone does not grant student access. Committee access and your officer roster identity are further, separate steps.</ns0:t>
       </ns0:r>
     </ns0:p>
     <ns0:p>
@@ -110,7 +110,7 @@
         <ns0:t>Continue</ns0:t>
       </ns0:r>
       <ns0:r>
-        <ns0:t>, and set a password. Email ownership confirmation gives you basic member dashboard access immediately; society verification is a later, separate review. You can also use an email sign-in link, or Google sign-in if its button is available. Microsoft sign-in is not offered.</ns0:t>
+        <ns0:t>, and set a password. Email ownership confirmation gives you EFDS member dashboard access immediately; student verification is a later, separate review. You can also use an email sign-in link, or Google sign-in if its button is available. Microsoft sign-in is not offered.</ns0:t>
       </ns0:r>
     </ns0:p>
     <ns0:p>
@@ -144,10 +144,10 @@
         <ns0:rPr>
           <ns0:b/>
         </ns0:rPr>
-        <ns0:t>Request society verification.</ns0:t>
+        <ns0:t>Request EFDS student verification.</ns0:t>
       </ns0:r>
       <ns0:r>
-        <ns0:t xml:space="preserve"> Open </ns0:t>
+        <ns0:t xml:space="preserve"> If you are enrolled on the EFDS BSc, open </ns0:t>
       </ns0:r>
       <ns0:hyperlink ns2:id="rId10">
         <ns0:r>
@@ -165,10 +165,10 @@
         <ns0:rPr>
           <ns0:b/>
         </ns0:rPr>
-        <ns0:t>EFDS membership</ns0:t>
+        <ns0:t>Student verification</ns0:t>
       </ns0:r>
       <ns0:r>
-        <ns0:t xml:space="preserve">, describe how you are connected to the society and select </ns0:t>
+        <ns0:t xml:space="preserve">, provide your degree and cohort, then select </ns0:t>
       </ns0:r>
       <ns0:r>
         <ns0:rPr>
@@ -177,7 +177,7 @@
         <ns0:t>Send for review</ns0:t>
       </ns0:r>
       <ns0:r>
-        <ns0:t>. Your university email confirms affiliation with Imperial, but does not by itself prove society membership. Your member account still has full event access while the review is pending.</ns0:t>
+        <ns0:t>. Do not include your student ID or documents. Your university email does not prove degree enrolment. Your EFDS member account keeps full event access while the review is pending.</ns0:t>
       </ns0:r>
     </ns0:p>
     <ns0:p>
@@ -274,7 +274,7 @@
         </ns0:r>
       </ns0:hyperlink>
       <ns0:r>
-        <ns0:t xml:space="preserve"> after the person signs in once. Check the current society or committee record through a trusted source. A name, student email or self-description alone is not sufficient evidence. The panel records the acting admin, decision and date. It prevents direct role changes, stale edits and more than two active accounts linking to the same officer entry.</ns0:t>
+        <ns0:t xml:space="preserve"> after the person requests EFDS student verification. Check an independent degree or cohort record through a trusted source. A name, Imperial email, society membership or self-description alone is not sufficient evidence. The panel records the acting admin, decision and date. It prevents direct role changes, stale edits and more than two active accounts linking to the same officer entry.</ns0:t>
       </ns0:r>
     </ns0:p>
     <ns0:p>
@@ -285,7 +285,7 @@
         <ns0:rPr>
           <ns0:b/>
         </ns0:rPr>
-        <ns0:t>Verify EFDS membership.</ns0:t>
+        <ns0:t>Verify EFDS student status.</ns0:t>
       </ns0:r>
       <ns0:r>
         <ns0:t xml:space="preserve"> In </ns0:t>
@@ -297,34 +297,33 @@
         <ns0:t>Needs review</ns0:t>
       </ns0:r>
       <ns0:r>
-        <ns0:t xml:space="preserve">, open the person's exact account. Compare their claim with an independent EFDS record. Select </ns0:t>
+        <ns0:t xml:space="preserve">, open the person's exact account. Compare their claim with an independent degree record. Select </ns0:t>
       </ns0:r>
       <ns0:r>
         <ns0:rPr>
           <ns0:b/>
         </ns0:rPr>
-        <ns0:t>Verify EFDS membership</ns0:t>
+        <ns0:t>Verify EFDS student status</ns0:t>
       </ns0:r>
       <ns0:r>
-        <ns0:t xml:space="preserve"> and save</ns0:t>
+        <ns0:t xml:space="preserve"> and save.</ns0:t>
       </ns0:r>
       <ns0:r>
         <ns0:rPr>
           <ns0:b/>
         </ns0:rPr>
-        <ns0:t/>
       </ns0:r>
       <ns0:r>
-        <ns0:t xml:space="preserve">. If the claim cannot be confirmed, select </ns0:t>
+        <ns0:t xml:space="preserve"> If the person is not an EFDS student, select </ns0:t>
       </ns0:r>
       <ns0:r>
         <ns0:rPr>
           <ns0:b/>
         </ns0:rPr>
-        <ns0:t>Decline verification</ns0:t>
+        <ns0:t>Confirm non-EFDS student</ns0:t>
       </ns0:r>
       <ns0:r>
-        <ns0:t> and ask the person for corrected details. A declined account remains visible for follow-up.</ns0:t>
+        <ns0:t>. The account keeps EFDS member event and public access, moves to Non-EFDS students, and can still be promoted later if their enrolment changes or the decision was mistaken.</ns0:t>
       </ns0:r>
     </ns0:p>
     <ns0:p>
@@ -521,7 +520,7 @@
           </ns0:tcPr>
           <ns0:p>
             <ns0:r>
-              <ns0:t>You can sign in, but only see member access</ns0:t>
+              <ns0:t>You can sign in, but only see EFDS member access</ns0:t>
             </ns0:r>
           </ns0:p>
         </ns0:tc>
@@ -531,7 +530,7 @@
           </ns0:tcPr>
           <ns0:p>
             <ns0:r>
-              <ns0:t>Complete the EFDS membership request on your profile; ask an admin to review the exact account email.</ns0:t>
+              <ns0:t>If you study the EFDS BSc, submit your degree and cohort on your profile; ask an admin to review the exact account email. Union society membership alone does not grant student resources.</ns0:t>
             </ns0:r>
           </ns0:p>
         </ns0:tc>
@@ -543,7 +542,7 @@
           </ns0:tcPr>
           <ns0:p>
             <ns0:r>
-              <ns0:t>EFDS member access is active, but Tickets is missing</ns0:t>
+              <ns0:t>EFDS student access is active, but Tickets is missing</ns0:t>
             </ns0:r>
           </ns0:p>
         </ns0:tc>

</xml_diff>